<commit_message>
fix(security-doc): prevent table splits across page breaks in DOCX output
- Small tables (<=12 rows) kept together on one page via keepWithNext chain
- Large tables get cantSplit rows + repeat header on each page
- Headings always stay with following content (keepWithNext)
- Regenerated Encypher_Security_Architecture_Document.docx
</commit_message>
<xml_diff>
--- a/docs/c2pa/conformance/submission/Encypher_Security_Architecture_Document.docx
+++ b/docs/c2pa/conformance/submission/Encypher_Security_Architecture_Document.docx
@@ -136,6 +136,8 @@
     <w:p>
       <w:pPr>
         <w:pStyle w:val="Heading1"/>
+        <w:keepNext/>
+        <w:pageBreakBefore w:val="0"/>
       </w:pPr>
       <w:r>
         <w:rPr>
@@ -170,6 +172,8 @@
     <w:p>
       <w:pPr>
         <w:pStyle w:val="Heading2"/>
+        <w:keepNext/>
+        <w:pageBreakBefore w:val="0"/>
       </w:pPr>
       <w:r>
         <w:rPr>
@@ -184,6 +188,8 @@
     <w:p>
       <w:pPr>
         <w:pStyle w:val="Heading3"/>
+        <w:keepNext/>
+        <w:pageBreakBefore w:val="0"/>
       </w:pPr>
       <w:r>
         <w:rPr>
@@ -373,6 +379,8 @@
     <w:p>
       <w:pPr>
         <w:pStyle w:val="Heading3"/>
+        <w:keepNext/>
+        <w:pageBreakBefore w:val="0"/>
       </w:pPr>
       <w:r>
         <w:rPr>
@@ -539,6 +547,8 @@
     <w:p>
       <w:pPr>
         <w:pStyle w:val="Heading3"/>
+        <w:keepNext/>
+        <w:pageBreakBefore w:val="0"/>
       </w:pPr>
       <w:r>
         <w:rPr>
@@ -850,6 +860,8 @@
     <w:p>
       <w:pPr>
         <w:pStyle w:val="Heading3"/>
+        <w:keepNext/>
+        <w:pageBreakBefore w:val="0"/>
       </w:pPr>
       <w:r>
         <w:rPr>
@@ -1721,6 +1733,10 @@
         <w:gridCol w:w="3120"/>
       </w:tblGrid>
       <w:tr>
+        <w:trPr>
+          <w:cantSplit/>
+          <w:tblHeader/>
+        </w:trPr>
         <w:tc>
           <w:tcPr>
             <w:tcW w:type="dxa" w:w="3120"/>
@@ -1783,6 +1799,9 @@
         </w:tc>
       </w:tr>
       <w:tr>
+        <w:trPr>
+          <w:cantSplit/>
+        </w:trPr>
         <w:tc>
           <w:tcPr>
             <w:tcW w:type="dxa" w:w="3120"/>
@@ -1839,6 +1858,9 @@
         </w:tc>
       </w:tr>
       <w:tr>
+        <w:trPr>
+          <w:cantSplit/>
+        </w:trPr>
         <w:tc>
           <w:tcPr>
             <w:tcW w:type="dxa" w:w="3120"/>
@@ -1895,6 +1917,9 @@
         </w:tc>
       </w:tr>
       <w:tr>
+        <w:trPr>
+          <w:cantSplit/>
+        </w:trPr>
         <w:tc>
           <w:tcPr>
             <w:tcW w:type="dxa" w:w="3120"/>
@@ -1951,6 +1976,9 @@
         </w:tc>
       </w:tr>
       <w:tr>
+        <w:trPr>
+          <w:cantSplit/>
+        </w:trPr>
         <w:tc>
           <w:tcPr>
             <w:tcW w:type="dxa" w:w="3120"/>
@@ -2007,6 +2035,9 @@
         </w:tc>
       </w:tr>
       <w:tr>
+        <w:trPr>
+          <w:cantSplit/>
+        </w:trPr>
         <w:tc>
           <w:tcPr>
             <w:tcW w:type="dxa" w:w="3120"/>
@@ -2063,6 +2094,9 @@
         </w:tc>
       </w:tr>
       <w:tr>
+        <w:trPr>
+          <w:cantSplit/>
+        </w:trPr>
         <w:tc>
           <w:tcPr>
             <w:tcW w:type="dxa" w:w="3120"/>
@@ -2119,6 +2153,9 @@
         </w:tc>
       </w:tr>
       <w:tr>
+        <w:trPr>
+          <w:cantSplit/>
+        </w:trPr>
         <w:tc>
           <w:tcPr>
             <w:tcW w:type="dxa" w:w="3120"/>
@@ -2175,6 +2212,9 @@
         </w:tc>
       </w:tr>
       <w:tr>
+        <w:trPr>
+          <w:cantSplit/>
+        </w:trPr>
         <w:tc>
           <w:tcPr>
             <w:tcW w:type="dxa" w:w="3120"/>
@@ -2231,6 +2271,9 @@
         </w:tc>
       </w:tr>
       <w:tr>
+        <w:trPr>
+          <w:cantSplit/>
+        </w:trPr>
         <w:tc>
           <w:tcPr>
             <w:tcW w:type="dxa" w:w="3120"/>
@@ -2287,6 +2330,9 @@
         </w:tc>
       </w:tr>
       <w:tr>
+        <w:trPr>
+          <w:cantSplit/>
+        </w:trPr>
         <w:tc>
           <w:tcPr>
             <w:tcW w:type="dxa" w:w="3120"/>
@@ -2343,6 +2389,9 @@
         </w:tc>
       </w:tr>
       <w:tr>
+        <w:trPr>
+          <w:cantSplit/>
+        </w:trPr>
         <w:tc>
           <w:tcPr>
             <w:tcW w:type="dxa" w:w="3120"/>
@@ -2399,6 +2448,9 @@
         </w:tc>
       </w:tr>
       <w:tr>
+        <w:trPr>
+          <w:cantSplit/>
+        </w:trPr>
         <w:tc>
           <w:tcPr>
             <w:tcW w:type="dxa" w:w="3120"/>
@@ -2459,6 +2511,8 @@
     <w:p>
       <w:pPr>
         <w:pStyle w:val="Heading3"/>
+        <w:keepNext/>
+        <w:pageBreakBefore w:val="0"/>
       </w:pPr>
       <w:r>
         <w:rPr>
@@ -2510,6 +2564,8 @@
     <w:p>
       <w:pPr>
         <w:pStyle w:val="Heading3"/>
+        <w:keepNext/>
+        <w:pageBreakBefore w:val="0"/>
       </w:pPr>
       <w:r>
         <w:rPr>
@@ -2561,6 +2617,8 @@
     <w:p>
       <w:pPr>
         <w:pStyle w:val="Heading3"/>
+        <w:keepNext/>
+        <w:pageBreakBefore w:val="0"/>
       </w:pPr>
       <w:r>
         <w:rPr>
@@ -3373,6 +3431,8 @@
     <w:p>
       <w:pPr>
         <w:pStyle w:val="Heading2"/>
+        <w:keepNext/>
+        <w:pageBreakBefore w:val="0"/>
       </w:pPr>
       <w:r>
         <w:rPr>
@@ -3387,6 +3447,8 @@
     <w:p>
       <w:pPr>
         <w:pStyle w:val="Heading3"/>
+        <w:keepNext/>
+        <w:pageBreakBefore w:val="0"/>
       </w:pPr>
       <w:r>
         <w:rPr>
@@ -3401,6 +3463,8 @@
     <w:p>
       <w:pPr>
         <w:pStyle w:val="Heading4"/>
+        <w:keepNext/>
+        <w:pageBreakBefore w:val="0"/>
       </w:pPr>
       <w:r>
         <w:rPr>
@@ -3714,6 +3778,8 @@
     <w:p>
       <w:pPr>
         <w:pStyle w:val="Heading4"/>
+        <w:keepNext/>
+        <w:pageBreakBefore w:val="0"/>
       </w:pPr>
       <w:r>
         <w:rPr>
@@ -3837,6 +3903,8 @@
     <w:p>
       <w:pPr>
         <w:pStyle w:val="Heading4"/>
+        <w:keepNext/>
+        <w:pageBreakBefore w:val="0"/>
       </w:pPr>
       <w:r>
         <w:rPr>
@@ -3863,6 +3931,8 @@
     <w:p>
       <w:pPr>
         <w:pStyle w:val="Heading3"/>
+        <w:keepNext/>
+        <w:pageBreakBefore w:val="0"/>
       </w:pPr>
       <w:r>
         <w:rPr>
@@ -3877,6 +3947,8 @@
     <w:p>
       <w:pPr>
         <w:pStyle w:val="Heading4"/>
+        <w:keepNext/>
+        <w:pageBreakBefore w:val="0"/>
       </w:pPr>
       <w:r>
         <w:rPr>
@@ -4538,6 +4610,8 @@
     <w:p>
       <w:pPr>
         <w:pStyle w:val="Heading4"/>
+        <w:keepNext/>
+        <w:pageBreakBefore w:val="0"/>
       </w:pPr>
       <w:r>
         <w:rPr>
@@ -4564,6 +4638,8 @@
     <w:p>
       <w:pPr>
         <w:pStyle w:val="Heading4"/>
+        <w:keepNext/>
+        <w:pageBreakBefore w:val="0"/>
       </w:pPr>
       <w:r>
         <w:rPr>
@@ -4590,6 +4666,8 @@
     <w:p>
       <w:pPr>
         <w:pStyle w:val="Heading3"/>
+        <w:keepNext/>
+        <w:pageBreakBefore w:val="0"/>
       </w:pPr>
       <w:r>
         <w:rPr>
@@ -4604,6 +4682,8 @@
     <w:p>
       <w:pPr>
         <w:pStyle w:val="Heading4"/>
+        <w:keepNext/>
+        <w:pageBreakBefore w:val="0"/>
       </w:pPr>
       <w:r>
         <w:rPr>
@@ -5135,6 +5215,8 @@
     <w:p>
       <w:pPr>
         <w:pStyle w:val="Heading4"/>
+        <w:keepNext/>
+        <w:pageBreakBefore w:val="0"/>
       </w:pPr>
       <w:r>
         <w:rPr>
@@ -5301,6 +5383,8 @@
     <w:p>
       <w:pPr>
         <w:pStyle w:val="Heading3"/>
+        <w:keepNext/>
+        <w:pageBreakBefore w:val="0"/>
       </w:pPr>
       <w:r>
         <w:rPr>
@@ -5398,6 +5482,10 @@
         <w:gridCol w:w="3120"/>
       </w:tblGrid>
       <w:tr>
+        <w:trPr>
+          <w:cantSplit/>
+          <w:tblHeader/>
+        </w:trPr>
         <w:tc>
           <w:tcPr>
             <w:tcW w:type="dxa" w:w="3120"/>
@@ -5405,6 +5493,7 @@
           </w:tcPr>
           <w:p>
             <w:pPr>
+              <w:keepNext/>
               <w:spacing w:before="60" w:after="60"/>
             </w:pPr>
             <w:r>
@@ -5425,6 +5514,7 @@
           </w:tcPr>
           <w:p>
             <w:pPr>
+              <w:keepNext/>
               <w:spacing w:before="60" w:after="60"/>
             </w:pPr>
             <w:r>
@@ -5445,6 +5535,7 @@
           </w:tcPr>
           <w:p>
             <w:pPr>
+              <w:keepNext/>
               <w:spacing w:before="60" w:after="60"/>
             </w:pPr>
             <w:r>
@@ -5460,6 +5551,9 @@
         </w:tc>
       </w:tr>
       <w:tr>
+        <w:trPr>
+          <w:cantSplit/>
+        </w:trPr>
         <w:tc>
           <w:tcPr>
             <w:tcW w:type="dxa" w:w="3120"/>
@@ -5467,6 +5561,7 @@
           </w:tcPr>
           <w:p>
             <w:pPr>
+              <w:keepNext/>
               <w:spacing w:before="60" w:after="60"/>
             </w:pPr>
             <w:r>
@@ -5485,6 +5580,7 @@
           </w:tcPr>
           <w:p>
             <w:pPr>
+              <w:keepNext/>
               <w:spacing w:before="60" w:after="60"/>
             </w:pPr>
             <w:r>
@@ -5503,6 +5599,7 @@
           </w:tcPr>
           <w:p>
             <w:pPr>
+              <w:keepNext/>
               <w:spacing w:before="60" w:after="60"/>
             </w:pPr>
             <w:r>
@@ -5516,6 +5613,9 @@
         </w:tc>
       </w:tr>
       <w:tr>
+        <w:trPr>
+          <w:cantSplit/>
+        </w:trPr>
         <w:tc>
           <w:tcPr>
             <w:tcW w:type="dxa" w:w="3120"/>
@@ -5523,6 +5623,7 @@
           </w:tcPr>
           <w:p>
             <w:pPr>
+              <w:keepNext/>
               <w:spacing w:before="60" w:after="60"/>
             </w:pPr>
             <w:r>
@@ -5541,6 +5642,7 @@
           </w:tcPr>
           <w:p>
             <w:pPr>
+              <w:keepNext/>
               <w:spacing w:before="60" w:after="60"/>
             </w:pPr>
             <w:r>
@@ -5559,6 +5661,7 @@
           </w:tcPr>
           <w:p>
             <w:pPr>
+              <w:keepNext/>
               <w:spacing w:before="60" w:after="60"/>
             </w:pPr>
             <w:r>
@@ -5572,6 +5675,9 @@
         </w:tc>
       </w:tr>
       <w:tr>
+        <w:trPr>
+          <w:cantSplit/>
+        </w:trPr>
         <w:tc>
           <w:tcPr>
             <w:tcW w:type="dxa" w:w="3120"/>
@@ -5579,6 +5685,7 @@
           </w:tcPr>
           <w:p>
             <w:pPr>
+              <w:keepNext/>
               <w:spacing w:before="60" w:after="60"/>
             </w:pPr>
             <w:r>
@@ -5597,6 +5704,7 @@
           </w:tcPr>
           <w:p>
             <w:pPr>
+              <w:keepNext/>
               <w:spacing w:before="60" w:after="60"/>
             </w:pPr>
             <w:r>
@@ -5615,6 +5723,7 @@
           </w:tcPr>
           <w:p>
             <w:pPr>
+              <w:keepNext/>
               <w:spacing w:before="60" w:after="60"/>
             </w:pPr>
             <w:r>
@@ -5628,6 +5737,9 @@
         </w:tc>
       </w:tr>
       <w:tr>
+        <w:trPr>
+          <w:cantSplit/>
+        </w:trPr>
         <w:tc>
           <w:tcPr>
             <w:tcW w:type="dxa" w:w="3120"/>
@@ -5635,6 +5747,7 @@
           </w:tcPr>
           <w:p>
             <w:pPr>
+              <w:keepNext/>
               <w:spacing w:before="60" w:after="60"/>
             </w:pPr>
             <w:r>
@@ -5653,6 +5766,7 @@
           </w:tcPr>
           <w:p>
             <w:pPr>
+              <w:keepNext/>
               <w:spacing w:before="60" w:after="60"/>
             </w:pPr>
             <w:r>
@@ -5671,6 +5785,7 @@
           </w:tcPr>
           <w:p>
             <w:pPr>
+              <w:keepNext/>
               <w:spacing w:before="60" w:after="60"/>
             </w:pPr>
             <w:r>
@@ -5684,6 +5799,9 @@
         </w:tc>
       </w:tr>
       <w:tr>
+        <w:trPr>
+          <w:cantSplit/>
+        </w:trPr>
         <w:tc>
           <w:tcPr>
             <w:tcW w:type="dxa" w:w="3120"/>
@@ -5691,6 +5809,7 @@
           </w:tcPr>
           <w:p>
             <w:pPr>
+              <w:keepNext/>
               <w:spacing w:before="60" w:after="60"/>
             </w:pPr>
             <w:r>
@@ -5709,6 +5828,7 @@
           </w:tcPr>
           <w:p>
             <w:pPr>
+              <w:keepNext/>
               <w:spacing w:before="60" w:after="60"/>
             </w:pPr>
             <w:r>
@@ -5727,6 +5847,7 @@
           </w:tcPr>
           <w:p>
             <w:pPr>
+              <w:keepNext/>
               <w:spacing w:before="60" w:after="60"/>
             </w:pPr>
             <w:r>
@@ -5740,6 +5861,9 @@
         </w:tc>
       </w:tr>
       <w:tr>
+        <w:trPr>
+          <w:cantSplit/>
+        </w:trPr>
         <w:tc>
           <w:tcPr>
             <w:tcW w:type="dxa" w:w="3120"/>
@@ -5747,6 +5871,7 @@
           </w:tcPr>
           <w:p>
             <w:pPr>
+              <w:keepNext/>
               <w:spacing w:before="60" w:after="60"/>
             </w:pPr>
             <w:r>
@@ -5765,6 +5890,7 @@
           </w:tcPr>
           <w:p>
             <w:pPr>
+              <w:keepNext/>
               <w:spacing w:before="60" w:after="60"/>
             </w:pPr>
             <w:r>
@@ -5783,6 +5909,7 @@
           </w:tcPr>
           <w:p>
             <w:pPr>
+              <w:keepNext/>
               <w:spacing w:before="60" w:after="60"/>
             </w:pPr>
             <w:r>
@@ -5796,6 +5923,9 @@
         </w:tc>
       </w:tr>
       <w:tr>
+        <w:trPr>
+          <w:cantSplit/>
+        </w:trPr>
         <w:tc>
           <w:tcPr>
             <w:tcW w:type="dxa" w:w="3120"/>
@@ -5803,6 +5933,7 @@
           </w:tcPr>
           <w:p>
             <w:pPr>
+              <w:keepNext/>
               <w:spacing w:before="60" w:after="60"/>
             </w:pPr>
             <w:r>
@@ -5821,6 +5952,7 @@
           </w:tcPr>
           <w:p>
             <w:pPr>
+              <w:keepNext/>
               <w:spacing w:before="60" w:after="60"/>
             </w:pPr>
             <w:r>
@@ -5839,6 +5971,7 @@
           </w:tcPr>
           <w:p>
             <w:pPr>
+              <w:keepNext/>
               <w:spacing w:before="60" w:after="60"/>
             </w:pPr>
             <w:r>
@@ -5852,6 +5985,9 @@
         </w:tc>
       </w:tr>
       <w:tr>
+        <w:trPr>
+          <w:cantSplit/>
+        </w:trPr>
         <w:tc>
           <w:tcPr>
             <w:tcW w:type="dxa" w:w="3120"/>
@@ -5949,6 +6085,8 @@
     <w:p>
       <w:pPr>
         <w:pStyle w:val="Heading4"/>
+        <w:keepNext/>
+        <w:pageBreakBefore w:val="0"/>
       </w:pPr>
       <w:r>
         <w:rPr>
@@ -5975,6 +6113,8 @@
     <w:p>
       <w:pPr>
         <w:pStyle w:val="Heading3"/>
+        <w:keepNext/>
+        <w:pageBreakBefore w:val="0"/>
       </w:pPr>
       <w:r>
         <w:rPr>
@@ -5989,6 +6129,8 @@
     <w:p>
       <w:pPr>
         <w:pStyle w:val="Heading4"/>
+        <w:keepNext/>
+        <w:pageBreakBefore w:val="0"/>
       </w:pPr>
       <w:r>
         <w:rPr>
@@ -6169,31 +6311,6 @@
     </w:p>
     <w:p>
       <w:pPr>
-        <w:spacing w:before="40" w:after="80"/>
-      </w:pPr>
-      <w:r>
-        <w:rPr>
-          <w:rFonts w:ascii="Calibri" w:hAnsi="Calibri"/>
-          <w:sz w:val="22"/>
-        </w:rPr>
-      </w:r>
-      <w:r>
-        <w:rPr>
-          <w:rFonts w:ascii="Calibri" w:hAnsi="Calibri"/>
-          <w:b/>
-          <w:sz w:val="22"/>
-        </w:rPr>
-        <w:t>2. API-to-TSA communication:</w:t>
-      </w:r>
-      <w:r>
-        <w:rPr>
-          <w:rFonts w:ascii="Calibri" w:hAnsi="Calibri"/>
-          <w:sz w:val="22"/>
-        </w:rPr>
-      </w:r>
-    </w:p>
-    <w:p>
-      <w:pPr>
         <w:pStyle w:val="NoSpacing"/>
         <w:spacing w:before="20" w:after="40"/>
         <w:ind w:left="619" w:hanging="259"/>
@@ -6210,7 +6327,21 @@
           <w:rFonts w:ascii="Calibri" w:hAnsi="Calibri"/>
           <w:sz w:val="22"/>
         </w:rPr>
-        <w:t>The RFC 3161 timestamp request to SSL.com's TSA (`http://ts.ssl.com`) uses HTTP. This is standard practice for RFC 3161 TSA endpoints -- the timestamp token itself is cryptographically signed by the TSA's certificate and its integrity is verified independently of the transport channel. The TSA response contains a signed timestamp that is bound to the claim hash, so transport-layer interception cannot forge a valid timestamp. Note: The config variable `c2pa_tsa_url` in `app/config.py` (line 154) allows configuration of the TSA endpoint. SSL.com also offers HTTPS TSA endpoints at `https://api.c2patool.io/api/v1/timestamps/ecc` and `https://api.c2patool.io/api/v1/timestamps/rsa`.</w:t>
+      </w:r>
+      <w:r>
+        <w:rPr>
+          <w:rFonts w:ascii="Calibri" w:hAnsi="Calibri"/>
+          <w:b/>
+          <w:sz w:val="22"/>
+        </w:rPr>
+        <w:t>Verification</w:t>
+      </w:r>
+      <w:r>
+        <w:rPr>
+          <w:rFonts w:ascii="Calibri" w:hAnsi="Calibri"/>
+          <w:sz w:val="22"/>
+        </w:rPr>
+        <w:t>: TLS 1.3 enforcement can be independently verified:</w:t>
       </w:r>
     </w:p>
     <w:p>
@@ -6222,6 +6353,30 @@
           <w:rFonts w:ascii="Calibri" w:hAnsi="Calibri"/>
           <w:sz w:val="22"/>
         </w:rPr>
+        <w:t xml:space="preserve">      openssl s_client -connect api.encypher.com:443 -tls1_2 &lt;/dev/null 2&gt;&amp;1 # Expected: "tlsv1 alert protocol version" (connection refused)</w:t>
+      </w:r>
+    </w:p>
+    <w:p>
+      <w:pPr>
+        <w:spacing w:before="40" w:after="80"/>
+      </w:pPr>
+      <w:r>
+        <w:rPr>
+          <w:rFonts w:ascii="Calibri" w:hAnsi="Calibri"/>
+          <w:sz w:val="22"/>
+        </w:rPr>
+        <w:t xml:space="preserve">      openssl s_client -connect api.encypher.com:443 -tls1_3 &lt;/dev/null 2&gt;&amp;1 # Expected: successful handshake</w:t>
+      </w:r>
+    </w:p>
+    <w:p>
+      <w:pPr>
+        <w:spacing w:before="40" w:after="80"/>
+      </w:pPr>
+      <w:r>
+        <w:rPr>
+          <w:rFonts w:ascii="Calibri" w:hAnsi="Calibri"/>
+          <w:sz w:val="22"/>
+        </w:rPr>
       </w:r>
       <w:r>
         <w:rPr>
@@ -6229,7 +6384,7 @@
           <w:b/>
           <w:sz w:val="22"/>
         </w:rPr>
-        <w:t>3. API-to-internal-services communication:</w:t>
+        <w:t>2. API-to-TSA communication:</w:t>
       </w:r>
       <w:r>
         <w:rPr>
@@ -6256,7 +6411,7 @@
           <w:rFonts w:ascii="Calibri" w:hAnsi="Calibri"/>
           <w:sz w:val="22"/>
         </w:rPr>
-        <w:t>Communication between the Enterprise API and internal services (Auth Service, Key Service) uses HTTPS with Bearer token authentication. Service URLs are configured via environment variables (`auth_service_url`, `key_service_url` in `app/config.py`).</w:t>
+        <w:t>The RFC 3161 timestamp request to SSL.com's TSA (`http://ts.ssl.com`) uses HTTP. This is standard practice for RFC 3161 TSA endpoints -- the timestamp token itself is cryptographically signed by the TSA's certificate and its integrity is verified independently of the transport channel. The TSA response contains a signed timestamp that is bound to the claim hash, so transport-layer interception cannot forge a valid timestamp. Note: The config variable `c2pa_tsa_url` in `app/config.py` (line 154) allows configuration of the TSA endpoint. SSL.com also offers HTTPS TSA endpoints at `https://api.c2patool.io/api/v1/timestamps/ecc` and `https://api.c2patool.io/api/v1/timestamps/rsa`.</w:t>
       </w:r>
     </w:p>
     <w:p>
@@ -6275,7 +6430,7 @@
           <w:b/>
           <w:sz w:val="22"/>
         </w:rPr>
-        <w:t>4. Trust list retrieval:</w:t>
+        <w:t>3. API-to-internal-services communication:</w:t>
       </w:r>
       <w:r>
         <w:rPr>
@@ -6302,6 +6457,52 @@
           <w:rFonts w:ascii="Calibri" w:hAnsi="Calibri"/>
           <w:sz w:val="22"/>
         </w:rPr>
+        <w:t>Communication between the Enterprise API and internal services (Auth Service, Key Service) uses HTTPS with Bearer token authentication. Service URLs are configured via environment variables (`auth_service_url`, `key_service_url` in `app/config.py`).</w:t>
+      </w:r>
+    </w:p>
+    <w:p>
+      <w:pPr>
+        <w:spacing w:before="40" w:after="80"/>
+      </w:pPr>
+      <w:r>
+        <w:rPr>
+          <w:rFonts w:ascii="Calibri" w:hAnsi="Calibri"/>
+          <w:sz w:val="22"/>
+        </w:rPr>
+      </w:r>
+      <w:r>
+        <w:rPr>
+          <w:rFonts w:ascii="Calibri" w:hAnsi="Calibri"/>
+          <w:b/>
+          <w:sz w:val="22"/>
+        </w:rPr>
+        <w:t>4. Trust list retrieval:</w:t>
+      </w:r>
+      <w:r>
+        <w:rPr>
+          <w:rFonts w:ascii="Calibri" w:hAnsi="Calibri"/>
+          <w:sz w:val="22"/>
+        </w:rPr>
+      </w:r>
+    </w:p>
+    <w:p>
+      <w:pPr>
+        <w:pStyle w:val="NoSpacing"/>
+        <w:spacing w:before="20" w:after="40"/>
+        <w:ind w:left="619" w:hanging="259"/>
+      </w:pPr>
+      <w:r>
+        <w:rPr>
+          <w:rFonts w:ascii="Calibri" w:hAnsi="Calibri"/>
+          <w:sz w:val="22"/>
+        </w:rPr>
+        <w:t xml:space="preserve">- </w:t>
+      </w:r>
+      <w:r>
+        <w:rPr>
+          <w:rFonts w:ascii="Calibri" w:hAnsi="Calibri"/>
+          <w:sz w:val="22"/>
+        </w:rPr>
         <w:t>The C2PA Trust List and TSA Trust List are fetched via HTTPS from GitHub's raw content delivery:</w:t>
       </w:r>
     </w:p>
@@ -6371,6 +6572,8 @@
     <w:p>
       <w:pPr>
         <w:pStyle w:val="Heading4"/>
+        <w:keepNext/>
+        <w:pageBreakBefore w:val="0"/>
       </w:pPr>
       <w:r>
         <w:rPr>
@@ -6439,6 +6642,8 @@
     <w:p>
       <w:pPr>
         <w:pStyle w:val="Heading3"/>
+        <w:keepNext/>
+        <w:pageBreakBefore w:val="0"/>
       </w:pPr>
       <w:r>
         <w:rPr>
@@ -6868,6 +7073,10 @@
         <w:gridCol w:w="3120"/>
       </w:tblGrid>
       <w:tr>
+        <w:trPr>
+          <w:cantSplit/>
+          <w:tblHeader/>
+        </w:trPr>
         <w:tc>
           <w:tcPr>
             <w:tcW w:type="dxa" w:w="3120"/>
@@ -6875,6 +7084,7 @@
           </w:tcPr>
           <w:p>
             <w:pPr>
+              <w:keepNext/>
               <w:spacing w:before="60" w:after="60"/>
             </w:pPr>
             <w:r>
@@ -6895,6 +7105,7 @@
           </w:tcPr>
           <w:p>
             <w:pPr>
+              <w:keepNext/>
               <w:spacing w:before="60" w:after="60"/>
             </w:pPr>
             <w:r>
@@ -6915,6 +7126,7 @@
           </w:tcPr>
           <w:p>
             <w:pPr>
+              <w:keepNext/>
               <w:spacing w:before="60" w:after="60"/>
             </w:pPr>
             <w:r>
@@ -6930,6 +7142,9 @@
         </w:tc>
       </w:tr>
       <w:tr>
+        <w:trPr>
+          <w:cantSplit/>
+        </w:trPr>
         <w:tc>
           <w:tcPr>
             <w:tcW w:type="dxa" w:w="3120"/>
@@ -6937,6 +7152,7 @@
           </w:tcPr>
           <w:p>
             <w:pPr>
+              <w:keepNext/>
               <w:spacing w:before="60" w:after="60"/>
             </w:pPr>
             <w:r>
@@ -6955,6 +7171,7 @@
           </w:tcPr>
           <w:p>
             <w:pPr>
+              <w:keepNext/>
               <w:spacing w:before="60" w:after="60"/>
             </w:pPr>
             <w:r>
@@ -6973,6 +7190,7 @@
           </w:tcPr>
           <w:p>
             <w:pPr>
+              <w:keepNext/>
               <w:spacing w:before="60" w:after="60"/>
             </w:pPr>
             <w:r>
@@ -6986,6 +7204,9 @@
         </w:tc>
       </w:tr>
       <w:tr>
+        <w:trPr>
+          <w:cantSplit/>
+        </w:trPr>
         <w:tc>
           <w:tcPr>
             <w:tcW w:type="dxa" w:w="3120"/>
@@ -6993,6 +7214,7 @@
           </w:tcPr>
           <w:p>
             <w:pPr>
+              <w:keepNext/>
               <w:spacing w:before="60" w:after="60"/>
             </w:pPr>
             <w:r>
@@ -7011,6 +7233,7 @@
           </w:tcPr>
           <w:p>
             <w:pPr>
+              <w:keepNext/>
               <w:spacing w:before="60" w:after="60"/>
             </w:pPr>
             <w:r>
@@ -7029,6 +7252,7 @@
           </w:tcPr>
           <w:p>
             <w:pPr>
+              <w:keepNext/>
               <w:spacing w:before="60" w:after="60"/>
             </w:pPr>
             <w:r>
@@ -7042,6 +7266,9 @@
         </w:tc>
       </w:tr>
       <w:tr>
+        <w:trPr>
+          <w:cantSplit/>
+        </w:trPr>
         <w:tc>
           <w:tcPr>
             <w:tcW w:type="dxa" w:w="3120"/>
@@ -7049,6 +7276,7 @@
           </w:tcPr>
           <w:p>
             <w:pPr>
+              <w:keepNext/>
               <w:spacing w:before="60" w:after="60"/>
             </w:pPr>
             <w:r>
@@ -7067,6 +7295,7 @@
           </w:tcPr>
           <w:p>
             <w:pPr>
+              <w:keepNext/>
               <w:spacing w:before="60" w:after="60"/>
             </w:pPr>
             <w:r>
@@ -7085,6 +7314,7 @@
           </w:tcPr>
           <w:p>
             <w:pPr>
+              <w:keepNext/>
               <w:spacing w:before="60" w:after="60"/>
             </w:pPr>
             <w:r>
@@ -7098,6 +7328,9 @@
         </w:tc>
       </w:tr>
       <w:tr>
+        <w:trPr>
+          <w:cantSplit/>
+        </w:trPr>
         <w:tc>
           <w:tcPr>
             <w:tcW w:type="dxa" w:w="3120"/>
@@ -7105,6 +7338,7 @@
           </w:tcPr>
           <w:p>
             <w:pPr>
+              <w:keepNext/>
               <w:spacing w:before="60" w:after="60"/>
             </w:pPr>
             <w:r>
@@ -7123,6 +7357,7 @@
           </w:tcPr>
           <w:p>
             <w:pPr>
+              <w:keepNext/>
               <w:spacing w:before="60" w:after="60"/>
             </w:pPr>
             <w:r>
@@ -7141,6 +7376,7 @@
           </w:tcPr>
           <w:p>
             <w:pPr>
+              <w:keepNext/>
               <w:spacing w:before="60" w:after="60"/>
             </w:pPr>
             <w:r>
@@ -7154,6 +7390,9 @@
         </w:tc>
       </w:tr>
       <w:tr>
+        <w:trPr>
+          <w:cantSplit/>
+        </w:trPr>
         <w:tc>
           <w:tcPr>
             <w:tcW w:type="dxa" w:w="3120"/>
@@ -7161,6 +7400,7 @@
           </w:tcPr>
           <w:p>
             <w:pPr>
+              <w:keepNext/>
               <w:spacing w:before="60" w:after="60"/>
             </w:pPr>
             <w:r>
@@ -7179,6 +7419,7 @@
           </w:tcPr>
           <w:p>
             <w:pPr>
+              <w:keepNext/>
               <w:spacing w:before="60" w:after="60"/>
             </w:pPr>
             <w:r>
@@ -7197,6 +7438,7 @@
           </w:tcPr>
           <w:p>
             <w:pPr>
+              <w:keepNext/>
               <w:spacing w:before="60" w:after="60"/>
             </w:pPr>
             <w:r>
@@ -7210,6 +7452,9 @@
         </w:tc>
       </w:tr>
       <w:tr>
+        <w:trPr>
+          <w:cantSplit/>
+        </w:trPr>
         <w:tc>
           <w:tcPr>
             <w:tcW w:type="dxa" w:w="3120"/>
@@ -7217,6 +7462,7 @@
           </w:tcPr>
           <w:p>
             <w:pPr>
+              <w:keepNext/>
               <w:spacing w:before="60" w:after="60"/>
             </w:pPr>
             <w:r>
@@ -7235,6 +7481,7 @@
           </w:tcPr>
           <w:p>
             <w:pPr>
+              <w:keepNext/>
               <w:spacing w:before="60" w:after="60"/>
             </w:pPr>
             <w:r>
@@ -7253,6 +7500,7 @@
           </w:tcPr>
           <w:p>
             <w:pPr>
+              <w:keepNext/>
               <w:spacing w:before="60" w:after="60"/>
             </w:pPr>
             <w:r>
@@ -7266,6 +7514,9 @@
         </w:tc>
       </w:tr>
       <w:tr>
+        <w:trPr>
+          <w:cantSplit/>
+        </w:trPr>
         <w:tc>
           <w:tcPr>
             <w:tcW w:type="dxa" w:w="3120"/>
@@ -7846,6 +8097,8 @@
     <w:p>
       <w:pPr>
         <w:pStyle w:val="Heading4"/>
+        <w:keepNext/>
+        <w:pageBreakBefore w:val="0"/>
       </w:pPr>
       <w:r>
         <w:rPr>
@@ -7943,6 +8196,8 @@
     <w:p>
       <w:pPr>
         <w:pStyle w:val="Heading2"/>
+        <w:keepNext/>
+        <w:pageBreakBefore w:val="0"/>
       </w:pPr>
       <w:r>
         <w:rPr>
@@ -7967,6 +8222,10 @@
         <w:gridCol w:w="2340"/>
       </w:tblGrid>
       <w:tr>
+        <w:trPr>
+          <w:cantSplit/>
+          <w:tblHeader/>
+        </w:trPr>
         <w:tc>
           <w:tcPr>
             <w:tcW w:type="dxa" w:w="2340"/>
@@ -7974,6 +8233,7 @@
           </w:tcPr>
           <w:p>
             <w:pPr>
+              <w:keepNext/>
               <w:spacing w:before="60" w:after="60"/>
             </w:pPr>
             <w:r>
@@ -7994,6 +8254,7 @@
           </w:tcPr>
           <w:p>
             <w:pPr>
+              <w:keepNext/>
               <w:spacing w:before="60" w:after="60"/>
             </w:pPr>
             <w:r>
@@ -8014,6 +8275,7 @@
           </w:tcPr>
           <w:p>
             <w:pPr>
+              <w:keepNext/>
               <w:spacing w:before="60" w:after="60"/>
             </w:pPr>
             <w:r>
@@ -8034,6 +8296,7 @@
           </w:tcPr>
           <w:p>
             <w:pPr>
+              <w:keepNext/>
               <w:spacing w:before="60" w:after="60"/>
             </w:pPr>
             <w:r>
@@ -8049,6 +8312,9 @@
         </w:tc>
       </w:tr>
       <w:tr>
+        <w:trPr>
+          <w:cantSplit/>
+        </w:trPr>
         <w:tc>
           <w:tcPr>
             <w:tcW w:type="dxa" w:w="2340"/>
@@ -8056,6 +8322,7 @@
           </w:tcPr>
           <w:p>
             <w:pPr>
+              <w:keepNext/>
               <w:spacing w:before="60" w:after="60"/>
             </w:pPr>
             <w:r>
@@ -8074,6 +8341,7 @@
           </w:tcPr>
           <w:p>
             <w:pPr>
+              <w:keepNext/>
               <w:spacing w:before="60" w:after="60"/>
             </w:pPr>
             <w:r>
@@ -8092,6 +8360,7 @@
           </w:tcPr>
           <w:p>
             <w:pPr>
+              <w:keepNext/>
               <w:spacing w:before="60" w:after="60"/>
             </w:pPr>
             <w:r>
@@ -8110,6 +8379,7 @@
           </w:tcPr>
           <w:p>
             <w:pPr>
+              <w:keepNext/>
               <w:spacing w:before="60" w:after="60"/>
             </w:pPr>
             <w:r>
@@ -8123,6 +8393,9 @@
         </w:tc>
       </w:tr>
       <w:tr>
+        <w:trPr>
+          <w:cantSplit/>
+        </w:trPr>
         <w:tc>
           <w:tcPr>
             <w:tcW w:type="dxa" w:w="2340"/>
@@ -8130,6 +8403,7 @@
           </w:tcPr>
           <w:p>
             <w:pPr>
+              <w:keepNext/>
               <w:spacing w:before="60" w:after="60"/>
             </w:pPr>
             <w:r>
@@ -8148,6 +8422,7 @@
           </w:tcPr>
           <w:p>
             <w:pPr>
+              <w:keepNext/>
               <w:spacing w:before="60" w:after="60"/>
             </w:pPr>
             <w:r>
@@ -8166,6 +8441,7 @@
           </w:tcPr>
           <w:p>
             <w:pPr>
+              <w:keepNext/>
               <w:spacing w:before="60" w:after="60"/>
             </w:pPr>
             <w:r>
@@ -8184,6 +8460,7 @@
           </w:tcPr>
           <w:p>
             <w:pPr>
+              <w:keepNext/>
               <w:spacing w:before="60" w:after="60"/>
             </w:pPr>
             <w:r>
@@ -8197,6 +8474,9 @@
         </w:tc>
       </w:tr>
       <w:tr>
+        <w:trPr>
+          <w:cantSplit/>
+        </w:trPr>
         <w:tc>
           <w:tcPr>
             <w:tcW w:type="dxa" w:w="2340"/>
@@ -8204,6 +8484,7 @@
           </w:tcPr>
           <w:p>
             <w:pPr>
+              <w:keepNext/>
               <w:spacing w:before="60" w:after="60"/>
             </w:pPr>
             <w:r>
@@ -8222,6 +8503,7 @@
           </w:tcPr>
           <w:p>
             <w:pPr>
+              <w:keepNext/>
               <w:spacing w:before="60" w:after="60"/>
             </w:pPr>
             <w:r>
@@ -8240,6 +8522,7 @@
           </w:tcPr>
           <w:p>
             <w:pPr>
+              <w:keepNext/>
               <w:spacing w:before="60" w:after="60"/>
             </w:pPr>
             <w:r>
@@ -8258,6 +8541,7 @@
           </w:tcPr>
           <w:p>
             <w:pPr>
+              <w:keepNext/>
               <w:spacing w:before="60" w:after="60"/>
             </w:pPr>
             <w:r>
@@ -8271,6 +8555,9 @@
         </w:tc>
       </w:tr>
       <w:tr>
+        <w:trPr>
+          <w:cantSplit/>
+        </w:trPr>
         <w:tc>
           <w:tcPr>
             <w:tcW w:type="dxa" w:w="2340"/>
@@ -8278,6 +8565,7 @@
           </w:tcPr>
           <w:p>
             <w:pPr>
+              <w:keepNext/>
               <w:spacing w:before="60" w:after="60"/>
             </w:pPr>
             <w:r>
@@ -8296,6 +8584,7 @@
           </w:tcPr>
           <w:p>
             <w:pPr>
+              <w:keepNext/>
               <w:spacing w:before="60" w:after="60"/>
             </w:pPr>
             <w:r>
@@ -8314,6 +8603,7 @@
           </w:tcPr>
           <w:p>
             <w:pPr>
+              <w:keepNext/>
               <w:spacing w:before="60" w:after="60"/>
             </w:pPr>
             <w:r>
@@ -8332,6 +8622,7 @@
           </w:tcPr>
           <w:p>
             <w:pPr>
+              <w:keepNext/>
               <w:spacing w:before="60" w:after="60"/>
             </w:pPr>
             <w:r>
@@ -8345,6 +8636,9 @@
         </w:tc>
       </w:tr>
       <w:tr>
+        <w:trPr>
+          <w:cantSplit/>
+        </w:trPr>
         <w:tc>
           <w:tcPr>
             <w:tcW w:type="dxa" w:w="2340"/>
@@ -8352,6 +8646,7 @@
           </w:tcPr>
           <w:p>
             <w:pPr>
+              <w:keepNext/>
               <w:spacing w:before="60" w:after="60"/>
             </w:pPr>
             <w:r>
@@ -8370,6 +8665,7 @@
           </w:tcPr>
           <w:p>
             <w:pPr>
+              <w:keepNext/>
               <w:spacing w:before="60" w:after="60"/>
             </w:pPr>
             <w:r>
@@ -8388,6 +8684,7 @@
           </w:tcPr>
           <w:p>
             <w:pPr>
+              <w:keepNext/>
               <w:spacing w:before="60" w:after="60"/>
             </w:pPr>
             <w:r>
@@ -8406,6 +8703,7 @@
           </w:tcPr>
           <w:p>
             <w:pPr>
+              <w:keepNext/>
               <w:spacing w:before="60" w:after="60"/>
             </w:pPr>
             <w:r>
@@ -8419,6 +8717,9 @@
         </w:tc>
       </w:tr>
       <w:tr>
+        <w:trPr>
+          <w:cantSplit/>
+        </w:trPr>
         <w:tc>
           <w:tcPr>
             <w:tcW w:type="dxa" w:w="2340"/>
@@ -8426,6 +8727,7 @@
           </w:tcPr>
           <w:p>
             <w:pPr>
+              <w:keepNext/>
               <w:spacing w:before="60" w:after="60"/>
             </w:pPr>
             <w:r>
@@ -8444,6 +8746,7 @@
           </w:tcPr>
           <w:p>
             <w:pPr>
+              <w:keepNext/>
               <w:spacing w:before="60" w:after="60"/>
             </w:pPr>
             <w:r>
@@ -8462,6 +8765,7 @@
           </w:tcPr>
           <w:p>
             <w:pPr>
+              <w:keepNext/>
               <w:spacing w:before="60" w:after="60"/>
             </w:pPr>
             <w:r>
@@ -8480,6 +8784,7 @@
           </w:tcPr>
           <w:p>
             <w:pPr>
+              <w:keepNext/>
               <w:spacing w:before="60" w:after="60"/>
             </w:pPr>
             <w:r>
@@ -8493,6 +8798,9 @@
         </w:tc>
       </w:tr>
       <w:tr>
+        <w:trPr>
+          <w:cantSplit/>
+        </w:trPr>
         <w:tc>
           <w:tcPr>
             <w:tcW w:type="dxa" w:w="2340"/>
@@ -8500,6 +8808,7 @@
           </w:tcPr>
           <w:p>
             <w:pPr>
+              <w:keepNext/>
               <w:spacing w:before="60" w:after="60"/>
             </w:pPr>
             <w:r>
@@ -8518,6 +8827,7 @@
           </w:tcPr>
           <w:p>
             <w:pPr>
+              <w:keepNext/>
               <w:spacing w:before="60" w:after="60"/>
             </w:pPr>
             <w:r>
@@ -8536,6 +8846,7 @@
           </w:tcPr>
           <w:p>
             <w:pPr>
+              <w:keepNext/>
               <w:spacing w:before="60" w:after="60"/>
             </w:pPr>
             <w:r>
@@ -8554,6 +8865,7 @@
           </w:tcPr>
           <w:p>
             <w:pPr>
+              <w:keepNext/>
               <w:spacing w:before="60" w:after="60"/>
             </w:pPr>
             <w:r>
@@ -8567,6 +8879,9 @@
         </w:tc>
       </w:tr>
       <w:tr>
+        <w:trPr>
+          <w:cantSplit/>
+        </w:trPr>
         <w:tc>
           <w:tcPr>
             <w:tcW w:type="dxa" w:w="2340"/>
@@ -8574,6 +8889,7 @@
           </w:tcPr>
           <w:p>
             <w:pPr>
+              <w:keepNext/>
               <w:spacing w:before="60" w:after="60"/>
             </w:pPr>
             <w:r>
@@ -8592,6 +8908,7 @@
           </w:tcPr>
           <w:p>
             <w:pPr>
+              <w:keepNext/>
               <w:spacing w:before="60" w:after="60"/>
             </w:pPr>
             <w:r>
@@ -8610,6 +8927,7 @@
           </w:tcPr>
           <w:p>
             <w:pPr>
+              <w:keepNext/>
               <w:spacing w:before="60" w:after="60"/>
             </w:pPr>
             <w:r>
@@ -8628,6 +8946,7 @@
           </w:tcPr>
           <w:p>
             <w:pPr>
+              <w:keepNext/>
               <w:spacing w:before="60" w:after="60"/>
             </w:pPr>
             <w:r>
@@ -8641,6 +8960,9 @@
         </w:tc>
       </w:tr>
       <w:tr>
+        <w:trPr>
+          <w:cantSplit/>
+        </w:trPr>
         <w:tc>
           <w:tcPr>
             <w:tcW w:type="dxa" w:w="2340"/>
@@ -8648,6 +8970,7 @@
           </w:tcPr>
           <w:p>
             <w:pPr>
+              <w:keepNext/>
               <w:spacing w:before="60" w:after="60"/>
             </w:pPr>
             <w:r>
@@ -8666,6 +8989,7 @@
           </w:tcPr>
           <w:p>
             <w:pPr>
+              <w:keepNext/>
               <w:spacing w:before="60" w:after="60"/>
             </w:pPr>
             <w:r>
@@ -8684,6 +9008,7 @@
           </w:tcPr>
           <w:p>
             <w:pPr>
+              <w:keepNext/>
               <w:spacing w:before="60" w:after="60"/>
             </w:pPr>
             <w:r>
@@ -8702,6 +9027,7 @@
           </w:tcPr>
           <w:p>
             <w:pPr>
+              <w:keepNext/>
               <w:spacing w:before="60" w:after="60"/>
             </w:pPr>
             <w:r>
@@ -8715,6 +9041,9 @@
         </w:tc>
       </w:tr>
       <w:tr>
+        <w:trPr>
+          <w:cantSplit/>
+        </w:trPr>
         <w:tc>
           <w:tcPr>
             <w:tcW w:type="dxa" w:w="2340"/>
@@ -8805,6 +9134,8 @@
     <w:p>
       <w:pPr>
         <w:pStyle w:val="Heading2"/>
+        <w:keepNext/>
+        <w:pageBreakBefore w:val="0"/>
       </w:pPr>
       <w:r>
         <w:rPr>
@@ -8819,6 +9150,8 @@
     <w:p>
       <w:pPr>
         <w:pStyle w:val="Heading3"/>
+        <w:keepNext/>
+        <w:pageBreakBefore w:val="0"/>
       </w:pPr>
       <w:r>
         <w:rPr>
@@ -9086,6 +9419,8 @@
     <w:p>
       <w:pPr>
         <w:pStyle w:val="Heading3"/>
+        <w:keepNext/>
+        <w:pageBreakBefore w:val="0"/>
       </w:pPr>
       <w:r>
         <w:rPr>
@@ -9518,6 +9853,8 @@
     <w:p>
       <w:pPr>
         <w:pStyle w:val="Heading2"/>
+        <w:keepNext/>
+        <w:pageBreakBefore w:val="0"/>
       </w:pPr>
       <w:r>
         <w:rPr>
@@ -9544,6 +9881,8 @@
     <w:p>
       <w:pPr>
         <w:pStyle w:val="Heading3"/>
+        <w:keepNext/>
+        <w:pageBreakBefore w:val="0"/>
       </w:pPr>
       <w:r>
         <w:rPr>
@@ -9978,6 +10317,8 @@
     <w:p>
       <w:pPr>
         <w:pStyle w:val="Heading3"/>
+        <w:keepNext/>
+        <w:pageBreakBefore w:val="0"/>
       </w:pPr>
       <w:r>
         <w:rPr>
@@ -10228,6 +10569,8 @@
     <w:p>
       <w:pPr>
         <w:pStyle w:val="Heading2"/>
+        <w:keepNext/>
+        <w:pageBreakBefore w:val="0"/>
       </w:pPr>
       <w:r>
         <w:rPr>
@@ -10263,6 +10606,10 @@
         <w:gridCol w:w="3120"/>
       </w:tblGrid>
       <w:tr>
+        <w:trPr>
+          <w:cantSplit/>
+          <w:tblHeader/>
+        </w:trPr>
         <w:tc>
           <w:tcPr>
             <w:tcW w:type="dxa" w:w="3120"/>
@@ -10325,6 +10672,9 @@
         </w:tc>
       </w:tr>
       <w:tr>
+        <w:trPr>
+          <w:cantSplit/>
+        </w:trPr>
         <w:tc>
           <w:tcPr>
             <w:tcW w:type="dxa" w:w="3120"/>
@@ -10381,6 +10731,9 @@
         </w:tc>
       </w:tr>
       <w:tr>
+        <w:trPr>
+          <w:cantSplit/>
+        </w:trPr>
         <w:tc>
           <w:tcPr>
             <w:tcW w:type="dxa" w:w="3120"/>
@@ -10437,6 +10790,9 @@
         </w:tc>
       </w:tr>
       <w:tr>
+        <w:trPr>
+          <w:cantSplit/>
+        </w:trPr>
         <w:tc>
           <w:tcPr>
             <w:tcW w:type="dxa" w:w="3120"/>
@@ -10493,6 +10849,9 @@
         </w:tc>
       </w:tr>
       <w:tr>
+        <w:trPr>
+          <w:cantSplit/>
+        </w:trPr>
         <w:tc>
           <w:tcPr>
             <w:tcW w:type="dxa" w:w="3120"/>
@@ -10549,6 +10908,9 @@
         </w:tc>
       </w:tr>
       <w:tr>
+        <w:trPr>
+          <w:cantSplit/>
+        </w:trPr>
         <w:tc>
           <w:tcPr>
             <w:tcW w:type="dxa" w:w="3120"/>
@@ -10605,6 +10967,9 @@
         </w:tc>
       </w:tr>
       <w:tr>
+        <w:trPr>
+          <w:cantSplit/>
+        </w:trPr>
         <w:tc>
           <w:tcPr>
             <w:tcW w:type="dxa" w:w="3120"/>
@@ -10661,6 +11026,9 @@
         </w:tc>
       </w:tr>
       <w:tr>
+        <w:trPr>
+          <w:cantSplit/>
+        </w:trPr>
         <w:tc>
           <w:tcPr>
             <w:tcW w:type="dxa" w:w="3120"/>
@@ -10717,6 +11085,9 @@
         </w:tc>
       </w:tr>
       <w:tr>
+        <w:trPr>
+          <w:cantSplit/>
+        </w:trPr>
         <w:tc>
           <w:tcPr>
             <w:tcW w:type="dxa" w:w="3120"/>
@@ -10773,6 +11144,9 @@
         </w:tc>
       </w:tr>
       <w:tr>
+        <w:trPr>
+          <w:cantSplit/>
+        </w:trPr>
         <w:tc>
           <w:tcPr>
             <w:tcW w:type="dxa" w:w="3120"/>
@@ -10829,6 +11203,9 @@
         </w:tc>
       </w:tr>
       <w:tr>
+        <w:trPr>
+          <w:cantSplit/>
+        </w:trPr>
         <w:tc>
           <w:tcPr>
             <w:tcW w:type="dxa" w:w="3120"/>
@@ -10885,6 +11262,9 @@
         </w:tc>
       </w:tr>
       <w:tr>
+        <w:trPr>
+          <w:cantSplit/>
+        </w:trPr>
         <w:tc>
           <w:tcPr>
             <w:tcW w:type="dxa" w:w="3120"/>
@@ -10941,6 +11321,9 @@
         </w:tc>
       </w:tr>
       <w:tr>
+        <w:trPr>
+          <w:cantSplit/>
+        </w:trPr>
         <w:tc>
           <w:tcPr>
             <w:tcW w:type="dxa" w:w="3120"/>
@@ -10997,6 +11380,9 @@
         </w:tc>
       </w:tr>
       <w:tr>
+        <w:trPr>
+          <w:cantSplit/>
+        </w:trPr>
         <w:tc>
           <w:tcPr>
             <w:tcW w:type="dxa" w:w="3120"/>
@@ -11053,6 +11439,9 @@
         </w:tc>
       </w:tr>
       <w:tr>
+        <w:trPr>
+          <w:cantSplit/>
+        </w:trPr>
         <w:tc>
           <w:tcPr>
             <w:tcW w:type="dxa" w:w="3120"/>
@@ -11109,6 +11498,9 @@
         </w:tc>
       </w:tr>
       <w:tr>
+        <w:trPr>
+          <w:cantSplit/>
+        </w:trPr>
         <w:tc>
           <w:tcPr>
             <w:tcW w:type="dxa" w:w="3120"/>
@@ -11165,6 +11557,9 @@
         </w:tc>
       </w:tr>
       <w:tr>
+        <w:trPr>
+          <w:cantSplit/>
+        </w:trPr>
         <w:tc>
           <w:tcPr>
             <w:tcW w:type="dxa" w:w="3120"/>
@@ -11221,6 +11616,9 @@
         </w:tc>
       </w:tr>
       <w:tr>
+        <w:trPr>
+          <w:cantSplit/>
+        </w:trPr>
         <w:tc>
           <w:tcPr>
             <w:tcW w:type="dxa" w:w="3120"/>
@@ -11277,6 +11675,9 @@
         </w:tc>
       </w:tr>
       <w:tr>
+        <w:trPr>
+          <w:cantSplit/>
+        </w:trPr>
         <w:tc>
           <w:tcPr>
             <w:tcW w:type="dxa" w:w="3120"/>
@@ -11337,6 +11738,8 @@
     <w:p>
       <w:pPr>
         <w:pStyle w:val="Heading2"/>
+        <w:keepNext/>
+        <w:pageBreakBefore w:val="0"/>
       </w:pPr>
       <w:r>
         <w:rPr>
@@ -11363,6 +11766,8 @@
     <w:p>
       <w:pPr>
         <w:pStyle w:val="Heading3"/>
+        <w:keepNext/>
+        <w:pageBreakBefore w:val="0"/>
       </w:pPr>
       <w:r>
         <w:rPr>
@@ -11387,6 +11792,10 @@
         <w:gridCol w:w="2340"/>
       </w:tblGrid>
       <w:tr>
+        <w:trPr>
+          <w:cantSplit/>
+          <w:tblHeader/>
+        </w:trPr>
         <w:tc>
           <w:tcPr>
             <w:tcW w:type="dxa" w:w="2340"/>
@@ -11394,6 +11803,7 @@
           </w:tcPr>
           <w:p>
             <w:pPr>
+              <w:keepNext/>
               <w:spacing w:before="60" w:after="60"/>
             </w:pPr>
             <w:r>
@@ -11414,6 +11824,7 @@
           </w:tcPr>
           <w:p>
             <w:pPr>
+              <w:keepNext/>
               <w:spacing w:before="60" w:after="60"/>
             </w:pPr>
             <w:r>
@@ -11434,6 +11845,7 @@
           </w:tcPr>
           <w:p>
             <w:pPr>
+              <w:keepNext/>
               <w:spacing w:before="60" w:after="60"/>
             </w:pPr>
             <w:r>
@@ -11454,6 +11866,7 @@
           </w:tcPr>
           <w:p>
             <w:pPr>
+              <w:keepNext/>
               <w:spacing w:before="60" w:after="60"/>
             </w:pPr>
             <w:r>
@@ -11469,6 +11882,9 @@
         </w:tc>
       </w:tr>
       <w:tr>
+        <w:trPr>
+          <w:cantSplit/>
+        </w:trPr>
         <w:tc>
           <w:tcPr>
             <w:tcW w:type="dxa" w:w="2340"/>
@@ -11476,6 +11892,7 @@
           </w:tcPr>
           <w:p>
             <w:pPr>
+              <w:keepNext/>
               <w:spacing w:before="60" w:after="60"/>
             </w:pPr>
             <w:r>
@@ -11494,6 +11911,7 @@
           </w:tcPr>
           <w:p>
             <w:pPr>
+              <w:keepNext/>
               <w:spacing w:before="60" w:after="60"/>
             </w:pPr>
             <w:r>
@@ -11512,6 +11930,7 @@
           </w:tcPr>
           <w:p>
             <w:pPr>
+              <w:keepNext/>
               <w:spacing w:before="60" w:after="60"/>
             </w:pPr>
             <w:r>
@@ -11530,6 +11949,7 @@
           </w:tcPr>
           <w:p>
             <w:pPr>
+              <w:keepNext/>
               <w:spacing w:before="60" w:after="60"/>
             </w:pPr>
             <w:r>
@@ -11543,6 +11963,9 @@
         </w:tc>
       </w:tr>
       <w:tr>
+        <w:trPr>
+          <w:cantSplit/>
+        </w:trPr>
         <w:tc>
           <w:tcPr>
             <w:tcW w:type="dxa" w:w="2340"/>
@@ -11621,6 +12044,8 @@
     <w:p>
       <w:pPr>
         <w:pStyle w:val="Heading3"/>
+        <w:keepNext/>
+        <w:pageBreakBefore w:val="0"/>
       </w:pPr>
       <w:r>
         <w:rPr>
@@ -11645,6 +12070,10 @@
         <w:gridCol w:w="2340"/>
       </w:tblGrid>
       <w:tr>
+        <w:trPr>
+          <w:cantSplit/>
+          <w:tblHeader/>
+        </w:trPr>
         <w:tc>
           <w:tcPr>
             <w:tcW w:type="dxa" w:w="2340"/>
@@ -11652,6 +12081,7 @@
           </w:tcPr>
           <w:p>
             <w:pPr>
+              <w:keepNext/>
               <w:spacing w:before="60" w:after="60"/>
             </w:pPr>
             <w:r>
@@ -11672,6 +12102,7 @@
           </w:tcPr>
           <w:p>
             <w:pPr>
+              <w:keepNext/>
               <w:spacing w:before="60" w:after="60"/>
             </w:pPr>
             <w:r>
@@ -11692,6 +12123,7 @@
           </w:tcPr>
           <w:p>
             <w:pPr>
+              <w:keepNext/>
               <w:spacing w:before="60" w:after="60"/>
             </w:pPr>
             <w:r>
@@ -11712,6 +12144,7 @@
           </w:tcPr>
           <w:p>
             <w:pPr>
+              <w:keepNext/>
               <w:spacing w:before="60" w:after="60"/>
             </w:pPr>
             <w:r>
@@ -11727,6 +12160,9 @@
         </w:tc>
       </w:tr>
       <w:tr>
+        <w:trPr>
+          <w:cantSplit/>
+        </w:trPr>
         <w:tc>
           <w:tcPr>
             <w:tcW w:type="dxa" w:w="2340"/>
@@ -11734,6 +12170,7 @@
           </w:tcPr>
           <w:p>
             <w:pPr>
+              <w:keepNext/>
               <w:spacing w:before="60" w:after="60"/>
             </w:pPr>
             <w:r>
@@ -11752,6 +12189,7 @@
           </w:tcPr>
           <w:p>
             <w:pPr>
+              <w:keepNext/>
               <w:spacing w:before="60" w:after="60"/>
             </w:pPr>
             <w:r>
@@ -11770,6 +12208,7 @@
           </w:tcPr>
           <w:p>
             <w:pPr>
+              <w:keepNext/>
               <w:spacing w:before="60" w:after="60"/>
             </w:pPr>
             <w:r>
@@ -11788,6 +12227,7 @@
           </w:tcPr>
           <w:p>
             <w:pPr>
+              <w:keepNext/>
               <w:spacing w:before="60" w:after="60"/>
             </w:pPr>
             <w:r>
@@ -11801,6 +12241,9 @@
         </w:tc>
       </w:tr>
       <w:tr>
+        <w:trPr>
+          <w:cantSplit/>
+        </w:trPr>
         <w:tc>
           <w:tcPr>
             <w:tcW w:type="dxa" w:w="2340"/>
@@ -11808,6 +12251,7 @@
           </w:tcPr>
           <w:p>
             <w:pPr>
+              <w:keepNext/>
               <w:spacing w:before="60" w:after="60"/>
             </w:pPr>
             <w:r>
@@ -11826,6 +12270,7 @@
           </w:tcPr>
           <w:p>
             <w:pPr>
+              <w:keepNext/>
               <w:spacing w:before="60" w:after="60"/>
             </w:pPr>
             <w:r>
@@ -11844,6 +12289,7 @@
           </w:tcPr>
           <w:p>
             <w:pPr>
+              <w:keepNext/>
               <w:spacing w:before="60" w:after="60"/>
             </w:pPr>
             <w:r>
@@ -11862,6 +12308,7 @@
           </w:tcPr>
           <w:p>
             <w:pPr>
+              <w:keepNext/>
               <w:spacing w:before="60" w:after="60"/>
             </w:pPr>
             <w:r>
@@ -11875,6 +12322,9 @@
         </w:tc>
       </w:tr>
       <w:tr>
+        <w:trPr>
+          <w:cantSplit/>
+        </w:trPr>
         <w:tc>
           <w:tcPr>
             <w:tcW w:type="dxa" w:w="2340"/>
@@ -11882,6 +12332,7 @@
           </w:tcPr>
           <w:p>
             <w:pPr>
+              <w:keepNext/>
               <w:spacing w:before="60" w:after="60"/>
             </w:pPr>
             <w:r>
@@ -11900,6 +12351,7 @@
           </w:tcPr>
           <w:p>
             <w:pPr>
+              <w:keepNext/>
               <w:spacing w:before="60" w:after="60"/>
             </w:pPr>
             <w:r>
@@ -11918,6 +12370,7 @@
           </w:tcPr>
           <w:p>
             <w:pPr>
+              <w:keepNext/>
               <w:spacing w:before="60" w:after="60"/>
             </w:pPr>
             <w:r>
@@ -11936,6 +12389,7 @@
           </w:tcPr>
           <w:p>
             <w:pPr>
+              <w:keepNext/>
               <w:spacing w:before="60" w:after="60"/>
             </w:pPr>
             <w:r>
@@ -11949,6 +12403,9 @@
         </w:tc>
       </w:tr>
       <w:tr>
+        <w:trPr>
+          <w:cantSplit/>
+        </w:trPr>
         <w:tc>
           <w:tcPr>
             <w:tcW w:type="dxa" w:w="2340"/>
@@ -11956,6 +12413,7 @@
           </w:tcPr>
           <w:p>
             <w:pPr>
+              <w:keepNext/>
               <w:spacing w:before="60" w:after="60"/>
             </w:pPr>
             <w:r>
@@ -11974,6 +12432,7 @@
           </w:tcPr>
           <w:p>
             <w:pPr>
+              <w:keepNext/>
               <w:spacing w:before="60" w:after="60"/>
             </w:pPr>
             <w:r>
@@ -11992,6 +12451,7 @@
           </w:tcPr>
           <w:p>
             <w:pPr>
+              <w:keepNext/>
               <w:spacing w:before="60" w:after="60"/>
             </w:pPr>
             <w:r>
@@ -12010,6 +12470,7 @@
           </w:tcPr>
           <w:p>
             <w:pPr>
+              <w:keepNext/>
               <w:spacing w:before="60" w:after="60"/>
             </w:pPr>
             <w:r>
@@ -12023,6 +12484,9 @@
         </w:tc>
       </w:tr>
       <w:tr>
+        <w:trPr>
+          <w:cantSplit/>
+        </w:trPr>
         <w:tc>
           <w:tcPr>
             <w:tcW w:type="dxa" w:w="2340"/>
@@ -12030,6 +12494,7 @@
           </w:tcPr>
           <w:p>
             <w:pPr>
+              <w:keepNext/>
               <w:spacing w:before="60" w:after="60"/>
             </w:pPr>
             <w:r>
@@ -12048,6 +12513,7 @@
           </w:tcPr>
           <w:p>
             <w:pPr>
+              <w:keepNext/>
               <w:spacing w:before="60" w:after="60"/>
             </w:pPr>
             <w:r>
@@ -12066,6 +12532,7 @@
           </w:tcPr>
           <w:p>
             <w:pPr>
+              <w:keepNext/>
               <w:spacing w:before="60" w:after="60"/>
             </w:pPr>
             <w:r>
@@ -12084,6 +12551,7 @@
           </w:tcPr>
           <w:p>
             <w:pPr>
+              <w:keepNext/>
               <w:spacing w:before="60" w:after="60"/>
             </w:pPr>
             <w:r>
@@ -12097,6 +12565,9 @@
         </w:tc>
       </w:tr>
       <w:tr>
+        <w:trPr>
+          <w:cantSplit/>
+        </w:trPr>
         <w:tc>
           <w:tcPr>
             <w:tcW w:type="dxa" w:w="2340"/>
@@ -12104,6 +12575,7 @@
           </w:tcPr>
           <w:p>
             <w:pPr>
+              <w:keepNext/>
               <w:spacing w:before="60" w:after="60"/>
             </w:pPr>
             <w:r>
@@ -12122,6 +12594,7 @@
           </w:tcPr>
           <w:p>
             <w:pPr>
+              <w:keepNext/>
               <w:spacing w:before="60" w:after="60"/>
             </w:pPr>
             <w:r>
@@ -12140,6 +12613,7 @@
           </w:tcPr>
           <w:p>
             <w:pPr>
+              <w:keepNext/>
               <w:spacing w:before="60" w:after="60"/>
             </w:pPr>
             <w:r>
@@ -12158,6 +12632,7 @@
           </w:tcPr>
           <w:p>
             <w:pPr>
+              <w:keepNext/>
               <w:spacing w:before="60" w:after="60"/>
             </w:pPr>
             <w:r>
@@ -12171,6 +12646,9 @@
         </w:tc>
       </w:tr>
       <w:tr>
+        <w:trPr>
+          <w:cantSplit/>
+        </w:trPr>
         <w:tc>
           <w:tcPr>
             <w:tcW w:type="dxa" w:w="2340"/>
@@ -12178,6 +12656,7 @@
           </w:tcPr>
           <w:p>
             <w:pPr>
+              <w:keepNext/>
               <w:spacing w:before="60" w:after="60"/>
             </w:pPr>
             <w:r>
@@ -12196,6 +12675,7 @@
           </w:tcPr>
           <w:p>
             <w:pPr>
+              <w:keepNext/>
               <w:spacing w:before="60" w:after="60"/>
             </w:pPr>
             <w:r>
@@ -12214,6 +12694,7 @@
           </w:tcPr>
           <w:p>
             <w:pPr>
+              <w:keepNext/>
               <w:spacing w:before="60" w:after="60"/>
             </w:pPr>
             <w:r>
@@ -12232,6 +12713,7 @@
           </w:tcPr>
           <w:p>
             <w:pPr>
+              <w:keepNext/>
               <w:spacing w:before="60" w:after="60"/>
             </w:pPr>
             <w:r>
@@ -12245,6 +12727,9 @@
         </w:tc>
       </w:tr>
       <w:tr>
+        <w:trPr>
+          <w:cantSplit/>
+        </w:trPr>
         <w:tc>
           <w:tcPr>
             <w:tcW w:type="dxa" w:w="2340"/>
@@ -12252,6 +12737,7 @@
           </w:tcPr>
           <w:p>
             <w:pPr>
+              <w:keepNext/>
               <w:spacing w:before="60" w:after="60"/>
             </w:pPr>
             <w:r>
@@ -12270,6 +12756,7 @@
           </w:tcPr>
           <w:p>
             <w:pPr>
+              <w:keepNext/>
               <w:spacing w:before="60" w:after="60"/>
             </w:pPr>
             <w:r>
@@ -12288,6 +12775,7 @@
           </w:tcPr>
           <w:p>
             <w:pPr>
+              <w:keepNext/>
               <w:spacing w:before="60" w:after="60"/>
             </w:pPr>
             <w:r>
@@ -12306,6 +12794,7 @@
           </w:tcPr>
           <w:p>
             <w:pPr>
+              <w:keepNext/>
               <w:spacing w:before="60" w:after="60"/>
             </w:pPr>
             <w:r>
@@ -12319,6 +12808,9 @@
         </w:tc>
       </w:tr>
       <w:tr>
+        <w:trPr>
+          <w:cantSplit/>
+        </w:trPr>
         <w:tc>
           <w:tcPr>
             <w:tcW w:type="dxa" w:w="2340"/>
@@ -12397,6 +12889,8 @@
     <w:p>
       <w:pPr>
         <w:pStyle w:val="Heading3"/>
+        <w:keepNext/>
+        <w:pageBreakBefore w:val="0"/>
       </w:pPr>
       <w:r>
         <w:rPr>
@@ -12421,6 +12915,10 @@
         <w:gridCol w:w="2340"/>
       </w:tblGrid>
       <w:tr>
+        <w:trPr>
+          <w:cantSplit/>
+          <w:tblHeader/>
+        </w:trPr>
         <w:tc>
           <w:tcPr>
             <w:tcW w:type="dxa" w:w="2340"/>
@@ -12428,6 +12926,7 @@
           </w:tcPr>
           <w:p>
             <w:pPr>
+              <w:keepNext/>
               <w:spacing w:before="60" w:after="60"/>
             </w:pPr>
             <w:r>
@@ -12448,6 +12947,7 @@
           </w:tcPr>
           <w:p>
             <w:pPr>
+              <w:keepNext/>
               <w:spacing w:before="60" w:after="60"/>
             </w:pPr>
             <w:r>
@@ -12468,6 +12968,7 @@
           </w:tcPr>
           <w:p>
             <w:pPr>
+              <w:keepNext/>
               <w:spacing w:before="60" w:after="60"/>
             </w:pPr>
             <w:r>
@@ -12488,6 +12989,7 @@
           </w:tcPr>
           <w:p>
             <w:pPr>
+              <w:keepNext/>
               <w:spacing w:before="60" w:after="60"/>
             </w:pPr>
             <w:r>
@@ -12503,6 +13005,9 @@
         </w:tc>
       </w:tr>
       <w:tr>
+        <w:trPr>
+          <w:cantSplit/>
+        </w:trPr>
         <w:tc>
           <w:tcPr>
             <w:tcW w:type="dxa" w:w="2340"/>
@@ -12510,6 +13015,7 @@
           </w:tcPr>
           <w:p>
             <w:pPr>
+              <w:keepNext/>
               <w:spacing w:before="60" w:after="60"/>
             </w:pPr>
             <w:r>
@@ -12528,6 +13034,7 @@
           </w:tcPr>
           <w:p>
             <w:pPr>
+              <w:keepNext/>
               <w:spacing w:before="60" w:after="60"/>
             </w:pPr>
             <w:r>
@@ -12546,6 +13053,7 @@
           </w:tcPr>
           <w:p>
             <w:pPr>
+              <w:keepNext/>
               <w:spacing w:before="60" w:after="60"/>
             </w:pPr>
             <w:r>
@@ -12564,6 +13072,7 @@
           </w:tcPr>
           <w:p>
             <w:pPr>
+              <w:keepNext/>
               <w:spacing w:before="60" w:after="60"/>
             </w:pPr>
             <w:r>
@@ -12577,6 +13086,9 @@
         </w:tc>
       </w:tr>
       <w:tr>
+        <w:trPr>
+          <w:cantSplit/>
+        </w:trPr>
         <w:tc>
           <w:tcPr>
             <w:tcW w:type="dxa" w:w="2340"/>
@@ -12584,6 +13096,7 @@
           </w:tcPr>
           <w:p>
             <w:pPr>
+              <w:keepNext/>
               <w:spacing w:before="60" w:after="60"/>
             </w:pPr>
             <w:r>
@@ -12602,6 +13115,7 @@
           </w:tcPr>
           <w:p>
             <w:pPr>
+              <w:keepNext/>
               <w:spacing w:before="60" w:after="60"/>
             </w:pPr>
             <w:r>
@@ -12620,6 +13134,7 @@
           </w:tcPr>
           <w:p>
             <w:pPr>
+              <w:keepNext/>
               <w:spacing w:before="60" w:after="60"/>
             </w:pPr>
             <w:r>
@@ -12638,6 +13153,7 @@
           </w:tcPr>
           <w:p>
             <w:pPr>
+              <w:keepNext/>
               <w:spacing w:before="60" w:after="60"/>
             </w:pPr>
             <w:r>
@@ -12651,6 +13167,9 @@
         </w:tc>
       </w:tr>
       <w:tr>
+        <w:trPr>
+          <w:cantSplit/>
+        </w:trPr>
         <w:tc>
           <w:tcPr>
             <w:tcW w:type="dxa" w:w="2340"/>
@@ -12658,6 +13177,7 @@
           </w:tcPr>
           <w:p>
             <w:pPr>
+              <w:keepNext/>
               <w:spacing w:before="60" w:after="60"/>
             </w:pPr>
             <w:r>
@@ -12676,6 +13196,7 @@
           </w:tcPr>
           <w:p>
             <w:pPr>
+              <w:keepNext/>
               <w:spacing w:before="60" w:after="60"/>
             </w:pPr>
             <w:r>
@@ -12694,6 +13215,7 @@
           </w:tcPr>
           <w:p>
             <w:pPr>
+              <w:keepNext/>
               <w:spacing w:before="60" w:after="60"/>
             </w:pPr>
             <w:r>
@@ -12712,6 +13234,7 @@
           </w:tcPr>
           <w:p>
             <w:pPr>
+              <w:keepNext/>
               <w:spacing w:before="60" w:after="60"/>
             </w:pPr>
             <w:r>
@@ -12725,6 +13248,9 @@
         </w:tc>
       </w:tr>
       <w:tr>
+        <w:trPr>
+          <w:cantSplit/>
+        </w:trPr>
         <w:tc>
           <w:tcPr>
             <w:tcW w:type="dxa" w:w="2340"/>
@@ -12803,6 +13329,8 @@
     <w:p>
       <w:pPr>
         <w:pStyle w:val="Heading3"/>
+        <w:keepNext/>
+        <w:pageBreakBefore w:val="0"/>
       </w:pPr>
       <w:r>
         <w:rPr>
@@ -12827,6 +13355,10 @@
         <w:gridCol w:w="2340"/>
       </w:tblGrid>
       <w:tr>
+        <w:trPr>
+          <w:cantSplit/>
+          <w:tblHeader/>
+        </w:trPr>
         <w:tc>
           <w:tcPr>
             <w:tcW w:type="dxa" w:w="2340"/>
@@ -12834,6 +13366,7 @@
           </w:tcPr>
           <w:p>
             <w:pPr>
+              <w:keepNext/>
               <w:spacing w:before="60" w:after="60"/>
             </w:pPr>
             <w:r>
@@ -12854,6 +13387,7 @@
           </w:tcPr>
           <w:p>
             <w:pPr>
+              <w:keepNext/>
               <w:spacing w:before="60" w:after="60"/>
             </w:pPr>
             <w:r>
@@ -12874,6 +13408,7 @@
           </w:tcPr>
           <w:p>
             <w:pPr>
+              <w:keepNext/>
               <w:spacing w:before="60" w:after="60"/>
             </w:pPr>
             <w:r>
@@ -12894,6 +13429,7 @@
           </w:tcPr>
           <w:p>
             <w:pPr>
+              <w:keepNext/>
               <w:spacing w:before="60" w:after="60"/>
             </w:pPr>
             <w:r>
@@ -12909,6 +13445,9 @@
         </w:tc>
       </w:tr>
       <w:tr>
+        <w:trPr>
+          <w:cantSplit/>
+        </w:trPr>
         <w:tc>
           <w:tcPr>
             <w:tcW w:type="dxa" w:w="2340"/>
@@ -12916,6 +13455,7 @@
           </w:tcPr>
           <w:p>
             <w:pPr>
+              <w:keepNext/>
               <w:spacing w:before="60" w:after="60"/>
             </w:pPr>
             <w:r>
@@ -12934,6 +13474,7 @@
           </w:tcPr>
           <w:p>
             <w:pPr>
+              <w:keepNext/>
               <w:spacing w:before="60" w:after="60"/>
             </w:pPr>
             <w:r>
@@ -12952,6 +13493,7 @@
           </w:tcPr>
           <w:p>
             <w:pPr>
+              <w:keepNext/>
               <w:spacing w:before="60" w:after="60"/>
             </w:pPr>
             <w:r>
@@ -12970,6 +13512,7 @@
           </w:tcPr>
           <w:p>
             <w:pPr>
+              <w:keepNext/>
               <w:spacing w:before="60" w:after="60"/>
             </w:pPr>
             <w:r>
@@ -12983,6 +13526,9 @@
         </w:tc>
       </w:tr>
       <w:tr>
+        <w:trPr>
+          <w:cantSplit/>
+        </w:trPr>
         <w:tc>
           <w:tcPr>
             <w:tcW w:type="dxa" w:w="2340"/>
@@ -13061,6 +13607,8 @@
     <w:p>
       <w:pPr>
         <w:pStyle w:val="Heading3"/>
+        <w:keepNext/>
+        <w:pageBreakBefore w:val="0"/>
       </w:pPr>
       <w:r>
         <w:rPr>
@@ -13085,6 +13633,10 @@
         <w:gridCol w:w="2340"/>
       </w:tblGrid>
       <w:tr>
+        <w:trPr>
+          <w:cantSplit/>
+          <w:tblHeader/>
+        </w:trPr>
         <w:tc>
           <w:tcPr>
             <w:tcW w:type="dxa" w:w="2340"/>
@@ -13092,6 +13644,7 @@
           </w:tcPr>
           <w:p>
             <w:pPr>
+              <w:keepNext/>
               <w:spacing w:before="60" w:after="60"/>
             </w:pPr>
             <w:r>
@@ -13112,6 +13665,7 @@
           </w:tcPr>
           <w:p>
             <w:pPr>
+              <w:keepNext/>
               <w:spacing w:before="60" w:after="60"/>
             </w:pPr>
             <w:r>
@@ -13132,6 +13686,7 @@
           </w:tcPr>
           <w:p>
             <w:pPr>
+              <w:keepNext/>
               <w:spacing w:before="60" w:after="60"/>
             </w:pPr>
             <w:r>
@@ -13152,6 +13707,7 @@
           </w:tcPr>
           <w:p>
             <w:pPr>
+              <w:keepNext/>
               <w:spacing w:before="60" w:after="60"/>
             </w:pPr>
             <w:r>
@@ -13167,6 +13723,9 @@
         </w:tc>
       </w:tr>
       <w:tr>
+        <w:trPr>
+          <w:cantSplit/>
+        </w:trPr>
         <w:tc>
           <w:tcPr>
             <w:tcW w:type="dxa" w:w="2340"/>
@@ -13174,6 +13733,7 @@
           </w:tcPr>
           <w:p>
             <w:pPr>
+              <w:keepNext/>
               <w:spacing w:before="60" w:after="60"/>
             </w:pPr>
             <w:r>
@@ -13192,6 +13752,7 @@
           </w:tcPr>
           <w:p>
             <w:pPr>
+              <w:keepNext/>
               <w:spacing w:before="60" w:after="60"/>
             </w:pPr>
             <w:r>
@@ -13210,6 +13771,7 @@
           </w:tcPr>
           <w:p>
             <w:pPr>
+              <w:keepNext/>
               <w:spacing w:before="60" w:after="60"/>
             </w:pPr>
             <w:r>
@@ -13228,6 +13790,7 @@
           </w:tcPr>
           <w:p>
             <w:pPr>
+              <w:keepNext/>
               <w:spacing w:before="60" w:after="60"/>
             </w:pPr>
             <w:r>
@@ -13241,6 +13804,9 @@
         </w:tc>
       </w:tr>
       <w:tr>
+        <w:trPr>
+          <w:cantSplit/>
+        </w:trPr>
         <w:tc>
           <w:tcPr>
             <w:tcW w:type="dxa" w:w="2340"/>
@@ -13319,6 +13885,8 @@
     <w:p>
       <w:pPr>
         <w:pStyle w:val="Heading3"/>
+        <w:keepNext/>
+        <w:pageBreakBefore w:val="0"/>
       </w:pPr>
       <w:r>
         <w:rPr>
@@ -13343,6 +13911,10 @@
         <w:gridCol w:w="2340"/>
       </w:tblGrid>
       <w:tr>
+        <w:trPr>
+          <w:cantSplit/>
+          <w:tblHeader/>
+        </w:trPr>
         <w:tc>
           <w:tcPr>
             <w:tcW w:type="dxa" w:w="2340"/>
@@ -13350,6 +13922,7 @@
           </w:tcPr>
           <w:p>
             <w:pPr>
+              <w:keepNext/>
               <w:spacing w:before="60" w:after="60"/>
             </w:pPr>
             <w:r>
@@ -13370,6 +13943,7 @@
           </w:tcPr>
           <w:p>
             <w:pPr>
+              <w:keepNext/>
               <w:spacing w:before="60" w:after="60"/>
             </w:pPr>
             <w:r>
@@ -13390,6 +13964,7 @@
           </w:tcPr>
           <w:p>
             <w:pPr>
+              <w:keepNext/>
               <w:spacing w:before="60" w:after="60"/>
             </w:pPr>
             <w:r>
@@ -13410,6 +13985,7 @@
           </w:tcPr>
           <w:p>
             <w:pPr>
+              <w:keepNext/>
               <w:spacing w:before="60" w:after="60"/>
             </w:pPr>
             <w:r>
@@ -13425,6 +14001,9 @@
         </w:tc>
       </w:tr>
       <w:tr>
+        <w:trPr>
+          <w:cantSplit/>
+        </w:trPr>
         <w:tc>
           <w:tcPr>
             <w:tcW w:type="dxa" w:w="2340"/>
@@ -13432,6 +14011,7 @@
           </w:tcPr>
           <w:p>
             <w:pPr>
+              <w:keepNext/>
               <w:spacing w:before="60" w:after="60"/>
             </w:pPr>
             <w:r>
@@ -13450,6 +14030,7 @@
           </w:tcPr>
           <w:p>
             <w:pPr>
+              <w:keepNext/>
               <w:spacing w:before="60" w:after="60"/>
             </w:pPr>
             <w:r>
@@ -13468,6 +14049,7 @@
           </w:tcPr>
           <w:p>
             <w:pPr>
+              <w:keepNext/>
               <w:spacing w:before="60" w:after="60"/>
             </w:pPr>
             <w:r>
@@ -13486,6 +14068,7 @@
           </w:tcPr>
           <w:p>
             <w:pPr>
+              <w:keepNext/>
               <w:spacing w:before="60" w:after="60"/>
             </w:pPr>
             <w:r>
@@ -13499,6 +14082,9 @@
         </w:tc>
       </w:tr>
       <w:tr>
+        <w:trPr>
+          <w:cantSplit/>
+        </w:trPr>
         <w:tc>
           <w:tcPr>
             <w:tcW w:type="dxa" w:w="2340"/>
@@ -13506,6 +14092,7 @@
           </w:tcPr>
           <w:p>
             <w:pPr>
+              <w:keepNext/>
               <w:spacing w:before="60" w:after="60"/>
             </w:pPr>
             <w:r>
@@ -13524,6 +14111,7 @@
           </w:tcPr>
           <w:p>
             <w:pPr>
+              <w:keepNext/>
               <w:spacing w:before="60" w:after="60"/>
             </w:pPr>
             <w:r>
@@ -13542,6 +14130,7 @@
           </w:tcPr>
           <w:p>
             <w:pPr>
+              <w:keepNext/>
               <w:spacing w:before="60" w:after="60"/>
             </w:pPr>
             <w:r>
@@ -13560,6 +14149,7 @@
           </w:tcPr>
           <w:p>
             <w:pPr>
+              <w:keepNext/>
               <w:spacing w:before="60" w:after="60"/>
             </w:pPr>
             <w:r>
@@ -13573,6 +14163,9 @@
         </w:tc>
       </w:tr>
       <w:tr>
+        <w:trPr>
+          <w:cantSplit/>
+        </w:trPr>
         <w:tc>
           <w:tcPr>
             <w:tcW w:type="dxa" w:w="2340"/>
@@ -13580,6 +14173,7 @@
           </w:tcPr>
           <w:p>
             <w:pPr>
+              <w:keepNext/>
               <w:spacing w:before="60" w:after="60"/>
             </w:pPr>
             <w:r>
@@ -13598,6 +14192,7 @@
           </w:tcPr>
           <w:p>
             <w:pPr>
+              <w:keepNext/>
               <w:spacing w:before="60" w:after="60"/>
             </w:pPr>
             <w:r>
@@ -13616,6 +14211,7 @@
           </w:tcPr>
           <w:p>
             <w:pPr>
+              <w:keepNext/>
               <w:spacing w:before="60" w:after="60"/>
             </w:pPr>
             <w:r>
@@ -13634,6 +14230,7 @@
           </w:tcPr>
           <w:p>
             <w:pPr>
+              <w:keepNext/>
               <w:spacing w:before="60" w:after="60"/>
             </w:pPr>
             <w:r>
@@ -13647,6 +14244,9 @@
         </w:tc>
       </w:tr>
       <w:tr>
+        <w:trPr>
+          <w:cantSplit/>
+        </w:trPr>
         <w:tc>
           <w:tcPr>
             <w:tcW w:type="dxa" w:w="2340"/>
@@ -13654,6 +14254,7 @@
           </w:tcPr>
           <w:p>
             <w:pPr>
+              <w:keepNext/>
               <w:spacing w:before="60" w:after="60"/>
             </w:pPr>
             <w:r>
@@ -13672,6 +14273,7 @@
           </w:tcPr>
           <w:p>
             <w:pPr>
+              <w:keepNext/>
               <w:spacing w:before="60" w:after="60"/>
             </w:pPr>
             <w:r>
@@ -13690,6 +14292,7 @@
           </w:tcPr>
           <w:p>
             <w:pPr>
+              <w:keepNext/>
               <w:spacing w:before="60" w:after="60"/>
             </w:pPr>
             <w:r>
@@ -13708,6 +14311,7 @@
           </w:tcPr>
           <w:p>
             <w:pPr>
+              <w:keepNext/>
               <w:spacing w:before="60" w:after="60"/>
             </w:pPr>
             <w:r>
@@ -13721,6 +14325,9 @@
         </w:tc>
       </w:tr>
       <w:tr>
+        <w:trPr>
+          <w:cantSplit/>
+        </w:trPr>
         <w:tc>
           <w:tcPr>
             <w:tcW w:type="dxa" w:w="2340"/>
@@ -13728,6 +14335,7 @@
           </w:tcPr>
           <w:p>
             <w:pPr>
+              <w:keepNext/>
               <w:spacing w:before="60" w:after="60"/>
             </w:pPr>
             <w:r>
@@ -13746,6 +14354,7 @@
           </w:tcPr>
           <w:p>
             <w:pPr>
+              <w:keepNext/>
               <w:spacing w:before="60" w:after="60"/>
             </w:pPr>
             <w:r>
@@ -13764,6 +14373,7 @@
           </w:tcPr>
           <w:p>
             <w:pPr>
+              <w:keepNext/>
               <w:spacing w:before="60" w:after="60"/>
             </w:pPr>
             <w:r>
@@ -13782,6 +14392,7 @@
           </w:tcPr>
           <w:p>
             <w:pPr>
+              <w:keepNext/>
               <w:spacing w:before="60" w:after="60"/>
             </w:pPr>
             <w:r>
@@ -13795,6 +14406,9 @@
         </w:tc>
       </w:tr>
       <w:tr>
+        <w:trPr>
+          <w:cantSplit/>
+        </w:trPr>
         <w:tc>
           <w:tcPr>
             <w:tcW w:type="dxa" w:w="2340"/>
@@ -13802,6 +14416,7 @@
           </w:tcPr>
           <w:p>
             <w:pPr>
+              <w:keepNext/>
               <w:spacing w:before="60" w:after="60"/>
             </w:pPr>
             <w:r>
@@ -13820,6 +14435,7 @@
           </w:tcPr>
           <w:p>
             <w:pPr>
+              <w:keepNext/>
               <w:spacing w:before="60" w:after="60"/>
             </w:pPr>
             <w:r>
@@ -13838,6 +14454,7 @@
           </w:tcPr>
           <w:p>
             <w:pPr>
+              <w:keepNext/>
               <w:spacing w:before="60" w:after="60"/>
             </w:pPr>
             <w:r>
@@ -13856,6 +14473,7 @@
           </w:tcPr>
           <w:p>
             <w:pPr>
+              <w:keepNext/>
               <w:spacing w:before="60" w:after="60"/>
             </w:pPr>
             <w:r>
@@ -13869,6 +14487,9 @@
         </w:tc>
       </w:tr>
       <w:tr>
+        <w:trPr>
+          <w:cantSplit/>
+        </w:trPr>
         <w:tc>
           <w:tcPr>
             <w:tcW w:type="dxa" w:w="2340"/>
@@ -13876,6 +14497,7 @@
           </w:tcPr>
           <w:p>
             <w:pPr>
+              <w:keepNext/>
               <w:spacing w:before="60" w:after="60"/>
             </w:pPr>
             <w:r>
@@ -13894,6 +14516,7 @@
           </w:tcPr>
           <w:p>
             <w:pPr>
+              <w:keepNext/>
               <w:spacing w:before="60" w:after="60"/>
             </w:pPr>
             <w:r>
@@ -13912,6 +14535,7 @@
           </w:tcPr>
           <w:p>
             <w:pPr>
+              <w:keepNext/>
               <w:spacing w:before="60" w:after="60"/>
             </w:pPr>
             <w:r>
@@ -13930,6 +14554,7 @@
           </w:tcPr>
           <w:p>
             <w:pPr>
+              <w:keepNext/>
               <w:spacing w:before="60" w:after="60"/>
             </w:pPr>
             <w:r>
@@ -13943,6 +14568,9 @@
         </w:tc>
       </w:tr>
       <w:tr>
+        <w:trPr>
+          <w:cantSplit/>
+        </w:trPr>
         <w:tc>
           <w:tcPr>
             <w:tcW w:type="dxa" w:w="2340"/>
@@ -14029,6 +14657,8 @@
     <w:p>
       <w:pPr>
         <w:pStyle w:val="Heading2"/>
+        <w:keepNext/>
+        <w:pageBreakBefore w:val="0"/>
       </w:pPr>
       <w:r>
         <w:rPr>

</xml_diff>

<commit_message>
fix(security-doc): v1.1 -- org details, API key, remove resolved items, table pagination
- Update org jurisdiction to Dover, Delaware US (Country: US)
- Add conformance API key to title page
- Add AI/ML companies to target audience
- Remove "Summary of Resolved Items" section (internal tracking, not for submission)
- Keep small tables together on one page (keepWithNext chain for <=12 rows)
- Bump version to 1.1
</commit_message>
<xml_diff>
--- a/docs/c2pa/conformance/submission/Encypher_Security_Architecture_Document.docx
+++ b/docs/c2pa/conformance/submission/Encypher_Security_Architecture_Document.docx
@@ -105,7 +105,21 @@
           <w:b w:val="0"/>
           <w:sz w:val="22"/>
         </w:rPr>
-        <w:t>Version 1.0 -- 2026-03-25</w:t>
+        <w:t>Version 1.1 -- 2026-03-27</w:t>
+      </w:r>
+    </w:p>
+    <w:p>
+      <w:pPr>
+        <w:spacing w:before="0" w:after="120"/>
+        <w:jc w:val="center"/>
+      </w:pPr>
+      <w:r>
+        <w:rPr>
+          <w:rFonts w:ascii="Calibri" w:hAnsi="Calibri"/>
+          <w:b w:val="0"/>
+          <w:sz w:val="20"/>
+        </w:rPr>
+        <w:t>Conformance API Key: ency_-becFjzyiKTi0cbGObHr8AFLersjF_NN3MmEd8BCmes</w:t>
       </w:r>
     </w:p>
     <w:p>
@@ -158,7 +172,19 @@
           <w:rFonts w:ascii="Calibri" w:hAnsi="Calibri"/>
           <w:sz w:val="22"/>
         </w:rPr>
-        <w:t>C2PA Conformance Program Submission Encypher Corporation Version 1.0, 2026-03-25</w:t>
+        <w:t>C2PA Conformance Program Submission Encypher Corporation Version 1.1, 2026-03-27</w:t>
+      </w:r>
+    </w:p>
+    <w:p>
+      <w:pPr>
+        <w:spacing w:before="40" w:after="80"/>
+      </w:pPr>
+      <w:r>
+        <w:rPr>
+          <w:rFonts w:ascii="Calibri" w:hAnsi="Calibri"/>
+          <w:sz w:val="22"/>
+        </w:rPr>
+        <w:t>Conformance API Key: ency_-becFjzyiKTi0cbGObHr8AFLersjF_NN3MmEd8BCmes</w:t>
       </w:r>
     </w:p>
     <w:p>
@@ -268,7 +294,7 @@
           <w:rFonts w:ascii="Calibri" w:hAnsi="Calibri"/>
           <w:sz w:val="22"/>
         </w:rPr>
-        <w:t>: United Kingdom</w:t>
+        <w:t>: United States</w:t>
       </w:r>
     </w:p>
     <w:p>
@@ -303,7 +329,7 @@
           <w:rFonts w:ascii="Calibri" w:hAnsi="Calibri"/>
           <w:sz w:val="22"/>
         </w:rPr>
-        <w:t>: London, United Kingdom</w:t>
+        <w:t>: Dover, Delaware</w:t>
       </w:r>
     </w:p>
     <w:p>
@@ -541,7 +567,7 @@
           <w:rFonts w:ascii="Calibri" w:hAnsi="Calibri"/>
           <w:sz w:val="22"/>
         </w:rPr>
-        <w:t>: GB</w:t>
+        <w:t>: US</w:t>
       </w:r>
     </w:p>
     <w:p>
@@ -725,6 +751,27 @@
           <w:sz w:val="22"/>
         </w:rPr>
         <w:t>Software integrators building content provenance into their own products via API integration.</w:t>
+      </w:r>
+    </w:p>
+    <w:p>
+      <w:pPr>
+        <w:pStyle w:val="NoSpacing"/>
+        <w:spacing w:before="20" w:after="40"/>
+        <w:ind w:left="619" w:hanging="259"/>
+      </w:pPr>
+      <w:r>
+        <w:rPr>
+          <w:rFonts w:ascii="Calibri" w:hAnsi="Calibri"/>
+          <w:sz w:val="22"/>
+        </w:rPr>
+        <w:t xml:space="preserve">- </w:t>
+      </w:r>
+      <w:r>
+        <w:rPr>
+          <w:rFonts w:ascii="Calibri" w:hAnsi="Calibri"/>
+          <w:sz w:val="22"/>
+        </w:rPr>
+        <w:t>AI/ML companies that require machine-verifiable provenance for generated assets.</w:t>
       </w:r>
     </w:p>
     <w:p>
@@ -14656,349 +14703,6 @@
     </w:p>
     <w:p>
       <w:pPr>
-        <w:pStyle w:val="Heading2"/>
-        <w:keepNext/>
-        <w:pageBreakBefore w:val="0"/>
-      </w:pPr>
-      <w:r>
-        <w:rPr>
-          <w:rFonts w:ascii="Calibri" w:hAnsi="Calibri"/>
-          <w:b/>
-          <w:color w:val="2E74B5"/>
-          <w:sz w:val="28"/>
-        </w:rPr>
-        <w:t>Summary of Resolved Items</w:t>
-      </w:r>
-    </w:p>
-    <w:p>
-      <w:pPr>
-        <w:spacing w:before="40" w:after="80"/>
-      </w:pPr>
-      <w:r>
-        <w:rPr>
-          <w:rFonts w:ascii="Calibri" w:hAnsi="Calibri"/>
-          <w:sz w:val="22"/>
-        </w:rPr>
-      </w:r>
-      <w:r>
-        <w:rPr>
-          <w:rFonts w:ascii="Calibri" w:hAnsi="Calibri"/>
-          <w:b/>
-          <w:sz w:val="22"/>
-        </w:rPr>
-        <w:t>All 14 original placeholder items have been resolved:</w:t>
-      </w:r>
-      <w:r>
-        <w:rPr>
-          <w:rFonts w:ascii="Calibri" w:hAnsi="Calibri"/>
-          <w:sz w:val="22"/>
-        </w:rPr>
-      </w:r>
-    </w:p>
-    <w:p>
-      <w:pPr>
-        <w:pStyle w:val="NoSpacing"/>
-        <w:spacing w:before="20" w:after="40"/>
-        <w:ind w:left="619" w:hanging="259"/>
-      </w:pPr>
-      <w:r>
-        <w:rPr>
-          <w:rFonts w:ascii="Calibri" w:hAnsi="Calibri"/>
-          <w:sz w:val="22"/>
-        </w:rPr>
-        <w:t xml:space="preserve">1. </w:t>
-      </w:r>
-      <w:r>
-        <w:rPr>
-          <w:rFonts w:ascii="Calibri" w:hAnsi="Calibri"/>
-          <w:sz w:val="22"/>
-        </w:rPr>
-        <w:t>C.1.1 -- Compliance contact: Erik Svilich, CEO (erik.svilich@encypher.com)</w:t>
-      </w:r>
-    </w:p>
-    <w:p>
-      <w:pPr>
-        <w:pStyle w:val="NoSpacing"/>
-        <w:spacing w:before="20" w:after="40"/>
-        <w:ind w:left="619" w:hanging="259"/>
-      </w:pPr>
-      <w:r>
-        <w:rPr>
-          <w:rFonts w:ascii="Calibri" w:hAnsi="Calibri"/>
-          <w:sz w:val="22"/>
-        </w:rPr>
-        <w:t xml:space="preserve">2. </w:t>
-      </w:r>
-      <w:r>
-        <w:rPr>
-          <w:rFonts w:ascii="Calibri" w:hAnsi="Calibri"/>
-          <w:sz w:val="22"/>
-        </w:rPr>
-        <w:t>C.2.1 -- SSL.com enrollment: Via c2pasign portal (conformance testing); CA enrollment post-conformance</w:t>
-      </w:r>
-    </w:p>
-    <w:p>
-      <w:pPr>
-        <w:pStyle w:val="NoSpacing"/>
-        <w:spacing w:before="20" w:after="40"/>
-        <w:ind w:left="619" w:hanging="259"/>
-      </w:pPr>
-      <w:r>
-        <w:rPr>
-          <w:rFonts w:ascii="Calibri" w:hAnsi="Calibri"/>
-          <w:sz w:val="22"/>
-        </w:rPr>
-        <w:t xml:space="preserve">3. </w:t>
-      </w:r>
-      <w:r>
-        <w:rPr>
-          <w:rFonts w:ascii="Calibri" w:hAnsi="Calibri"/>
-          <w:sz w:val="22"/>
-        </w:rPr>
-        <w:t>C.2.1 -- Secrets management: Railway encrypted environment variables (AES-256)</w:t>
-      </w:r>
-    </w:p>
-    <w:p>
-      <w:pPr>
-        <w:pStyle w:val="NoSpacing"/>
-        <w:spacing w:before="20" w:after="40"/>
-        <w:ind w:left="619" w:hanging="259"/>
-      </w:pPr>
-      <w:r>
-        <w:rPr>
-          <w:rFonts w:ascii="Calibri" w:hAnsi="Calibri"/>
-          <w:sz w:val="22"/>
-        </w:rPr>
-        <w:t xml:space="preserve">4. </w:t>
-      </w:r>
-      <w:r>
-        <w:rPr>
-          <w:rFonts w:ascii="Calibri" w:hAnsi="Calibri"/>
-          <w:sz w:val="22"/>
-        </w:rPr>
-        <w:t>C.2.1 -- MFA on SSL.com: Confirmed enabled</w:t>
-      </w:r>
-    </w:p>
-    <w:p>
-      <w:pPr>
-        <w:pStyle w:val="NoSpacing"/>
-        <w:spacing w:before="20" w:after="40"/>
-        <w:ind w:left="619" w:hanging="259"/>
-      </w:pPr>
-      <w:r>
-        <w:rPr>
-          <w:rFonts w:ascii="Calibri" w:hAnsi="Calibri"/>
-          <w:sz w:val="22"/>
-        </w:rPr>
-        <w:t xml:space="preserve">5. </w:t>
-      </w:r>
-      <w:r>
-        <w:rPr>
-          <w:rFonts w:ascii="Calibri" w:hAnsi="Calibri"/>
-          <w:sz w:val="22"/>
-        </w:rPr>
-        <w:t>C.2.1 -- Personnel with access: Single individual (Erik Svilich, CEO)</w:t>
-      </w:r>
-    </w:p>
-    <w:p>
-      <w:pPr>
-        <w:pStyle w:val="NoSpacing"/>
-        <w:spacing w:before="20" w:after="40"/>
-        <w:ind w:left="619" w:hanging="259"/>
-      </w:pPr>
-      <w:r>
-        <w:rPr>
-          <w:rFonts w:ascii="Calibri" w:hAnsi="Calibri"/>
-          <w:sz w:val="22"/>
-        </w:rPr>
-        <w:t xml:space="preserve">6. </w:t>
-      </w:r>
-      <w:r>
-        <w:rPr>
-          <w:rFonts w:ascii="Calibri" w:hAnsi="Calibri"/>
-          <w:sz w:val="22"/>
-        </w:rPr>
-        <w:t>C.2.1 -- Dependabot: Alerts enabled at GitHub org level; no config file for auto-PRs</w:t>
-      </w:r>
-    </w:p>
-    <w:p>
-      <w:pPr>
-        <w:pStyle w:val="NoSpacing"/>
-        <w:spacing w:before="20" w:after="40"/>
-        <w:ind w:left="619" w:hanging="259"/>
-      </w:pPr>
-      <w:r>
-        <w:rPr>
-          <w:rFonts w:ascii="Calibri" w:hAnsi="Calibri"/>
-          <w:sz w:val="22"/>
-        </w:rPr>
-        <w:t xml:space="preserve">7. </w:t>
-      </w:r>
-      <w:r>
-        <w:rPr>
-          <w:rFonts w:ascii="Calibri" w:hAnsi="Calibri"/>
-          <w:sz w:val="22"/>
-        </w:rPr>
-        <w:t>C.2.2 -- Key generation: Via SSL.com c2pasign portal (conformance); CA process post-conformance</w:t>
-      </w:r>
-    </w:p>
-    <w:p>
-      <w:pPr>
-        <w:pStyle w:val="NoSpacing"/>
-        <w:spacing w:before="20" w:after="40"/>
-        <w:ind w:left="619" w:hanging="259"/>
-      </w:pPr>
-      <w:r>
-        <w:rPr>
-          <w:rFonts w:ascii="Calibri" w:hAnsi="Calibri"/>
-          <w:sz w:val="22"/>
-        </w:rPr>
-        <w:t xml:space="preserve">8. </w:t>
-      </w:r>
-      <w:r>
-        <w:rPr>
-          <w:rFonts w:ascii="Calibri" w:hAnsi="Calibri"/>
-          <w:sz w:val="22"/>
-        </w:rPr>
-        <w:t>C.2.2 -- Env var encryption at rest: Railway AES-256</w:t>
-      </w:r>
-    </w:p>
-    <w:p>
-      <w:pPr>
-        <w:pStyle w:val="NoSpacing"/>
-        <w:spacing w:before="20" w:after="40"/>
-        <w:ind w:left="619" w:hanging="259"/>
-      </w:pPr>
-      <w:r>
-        <w:rPr>
-          <w:rFonts w:ascii="Calibri" w:hAnsi="Calibri"/>
-          <w:sz w:val="22"/>
-        </w:rPr>
-        <w:t xml:space="preserve">9. </w:t>
-      </w:r>
-      <w:r>
-        <w:rPr>
-          <w:rFonts w:ascii="Calibri" w:hAnsi="Calibri"/>
-          <w:sz w:val="22"/>
-        </w:rPr>
-        <w:t>C.2.2 -- Key rotation frequency: Aligned with certificate validity period</w:t>
-      </w:r>
-    </w:p>
-    <w:p>
-      <w:pPr>
-        <w:pStyle w:val="NoSpacing"/>
-        <w:spacing w:before="20" w:after="40"/>
-        <w:ind w:left="619" w:hanging="259"/>
-      </w:pPr>
-      <w:r>
-        <w:rPr>
-          <w:rFonts w:ascii="Calibri" w:hAnsi="Calibri"/>
-          <w:sz w:val="22"/>
-        </w:rPr>
-        <w:t xml:space="preserve">10. </w:t>
-      </w:r>
-      <w:r>
-        <w:rPr>
-          <w:rFonts w:ascii="Calibri" w:hAnsi="Calibri"/>
-          <w:sz w:val="22"/>
-        </w:rPr>
-        <w:t>C.2.3 -- pip-audit evidence: Attached (remediation plan documented)</w:t>
-      </w:r>
-    </w:p>
-    <w:p>
-      <w:pPr>
-        <w:pStyle w:val="NoSpacing"/>
-        <w:spacing w:before="20" w:after="40"/>
-        <w:ind w:left="619" w:hanging="259"/>
-      </w:pPr>
-      <w:r>
-        <w:rPr>
-          <w:rFonts w:ascii="Calibri" w:hAnsi="Calibri"/>
-          <w:sz w:val="22"/>
-        </w:rPr>
-        <w:t xml:space="preserve">11. </w:t>
-      </w:r>
-      <w:r>
-        <w:rPr>
-          <w:rFonts w:ascii="Calibri" w:hAnsi="Calibri"/>
-          <w:sz w:val="22"/>
-        </w:rPr>
-        <w:t>C.2.5 -- TLS config: Railway edge proxy enforces TLS 1.3 minimum</w:t>
-      </w:r>
-    </w:p>
-    <w:p>
-      <w:pPr>
-        <w:pStyle w:val="NoSpacing"/>
-        <w:spacing w:before="20" w:after="40"/>
-        <w:ind w:left="619" w:hanging="259"/>
-      </w:pPr>
-      <w:r>
-        <w:rPr>
-          <w:rFonts w:ascii="Calibri" w:hAnsi="Calibri"/>
-          <w:sz w:val="22"/>
-        </w:rPr>
-        <w:t xml:space="preserve">12. </w:t>
-      </w:r>
-      <w:r>
-        <w:rPr>
-          <w:rFonts w:ascii="Calibri" w:hAnsi="Calibri"/>
-          <w:sz w:val="22"/>
-        </w:rPr>
-        <w:t>C.2.6 -- Hosting platform IAM: Railway team RBAC (Owner -- sole administrator)</w:t>
-      </w:r>
-    </w:p>
-    <w:p>
-      <w:pPr>
-        <w:pStyle w:val="NoSpacing"/>
-        <w:spacing w:before="20" w:after="40"/>
-        <w:ind w:left="619" w:hanging="259"/>
-      </w:pPr>
-      <w:r>
-        <w:rPr>
-          <w:rFonts w:ascii="Calibri" w:hAnsi="Calibri"/>
-          <w:sz w:val="22"/>
-        </w:rPr>
-        <w:t xml:space="preserve">13. </w:t>
-      </w:r>
-      <w:r>
-        <w:rPr>
-          <w:rFonts w:ascii="Calibri" w:hAnsi="Calibri"/>
-          <w:sz w:val="22"/>
-        </w:rPr>
-        <w:t>C.2.6 -- Human access: Single individual with production access (Erik Svilich, CEO)</w:t>
-      </w:r>
-    </w:p>
-    <w:p>
-      <w:pPr>
-        <w:pStyle w:val="NoSpacing"/>
-        <w:spacing w:before="20" w:after="40"/>
-        <w:ind w:left="619" w:hanging="259"/>
-      </w:pPr>
-      <w:r>
-        <w:rPr>
-          <w:rFonts w:ascii="Calibri" w:hAnsi="Calibri"/>
-          <w:sz w:val="22"/>
-        </w:rPr>
-        <w:t xml:space="preserve">14. </w:t>
-      </w:r>
-      <w:r>
-        <w:rPr>
-          <w:rFonts w:ascii="Calibri" w:hAnsi="Calibri"/>
-          <w:sz w:val="22"/>
-        </w:rPr>
-        <w:t>C.2.6 -- Vuln scanning: pip-audit + Trivy + TruffleHog in security-scan.yml</w:t>
-      </w:r>
-    </w:p>
-    <w:p>
-      <w:pPr>
-        <w:spacing w:before="120" w:after="120"/>
-        <w:pBdr>
-          <w:bottom w:val="single" w:sz="6" w:space="1" w:color="AAAAAA"/>
-        </w:pBdr>
-      </w:pPr>
-    </w:p>
-    <w:p>
-      <w:pPr>
         <w:spacing w:before="40" w:after="80"/>
       </w:pPr>
       <w:r>

</xml_diff>

<commit_message>
docs(c2pa): update API verification evidence and CURL examples for unified endpoint
- Update all CURL examples to use unified POST /api/v1/public/verify/media
  (multipart) instead of deprecated per-type endpoints (/verify/image, etc.)
- Replace old JSON-body verify examples with multipart form-data format
- Add text sign + verify round-trip example to evidence
- Add CURL examples appendix to security architecture document
- Add media verification endpoint documentation to extended capabilities section
- Update architecture diagram to show unified verify routing
- Refresh all API response JSON with live 2026-03-27 production test output
- Regenerate DOCX with updated content
</commit_message>
<xml_diff>
--- a/docs/c2pa/conformance/submission/Encypher_Security_Architecture_Document.docx
+++ b/docs/c2pa/conformance/submission/Encypher_Security_Architecture_Document.docx
@@ -10358,7 +10358,33 @@
           <w:rFonts w:ascii="Calibri" w:hAnsi="Calibri"/>
           <w:sz w:val="22"/>
         </w:rPr>
-        <w:t>: `POST /api/v1/public/verify-text` with JSON body `{"text": "signed text content"}`. Returns verification result with signer identity, timestamp, and tamper detection status.</w:t>
+        <w:t>: `POST /api/v1/public/verify` with JSON body `{"text": "signed text content"}`. Returns verification result with signer identity, timestamp, and tamper detection status.</w:t>
+      </w:r>
+    </w:p>
+    <w:p>
+      <w:pPr>
+        <w:spacing w:before="40" w:after="80"/>
+      </w:pPr>
+      <w:r>
+        <w:rPr>
+          <w:rFonts w:ascii="Calibri" w:hAnsi="Calibri"/>
+          <w:sz w:val="22"/>
+        </w:rPr>
+      </w:r>
+      <w:r>
+        <w:rPr>
+          <w:rFonts w:ascii="Calibri" w:hAnsi="Calibri"/>
+          <w:b/>
+          <w:sz w:val="22"/>
+        </w:rPr>
+        <w:t>Media verification endpoint</w:t>
+      </w:r>
+      <w:r>
+        <w:rPr>
+          <w:rFonts w:ascii="Calibri" w:hAnsi="Calibri"/>
+          <w:sz w:val="22"/>
+        </w:rPr>
+        <w:t>: `POST /api/v1/public/verify/media` with multipart/form-data (`file` + `mime_type` fields). Unified endpoint for all binary media types -- routes by MIME type to image, audio, video, document, or font verification. No authentication required.</w:t>
       </w:r>
     </w:p>
     <w:p>
@@ -11795,6 +11821,274 @@
           <w:color w:val="2E74B5"/>
           <w:sz w:val="28"/>
         </w:rPr>
+        <w:t>Appendix: API Verification CURL Examples</w:t>
+      </w:r>
+    </w:p>
+    <w:p>
+      <w:pPr>
+        <w:spacing w:before="40" w:after="80"/>
+      </w:pPr>
+      <w:r>
+        <w:rPr>
+          <w:rFonts w:ascii="Calibri" w:hAnsi="Calibri"/>
+          <w:sz w:val="22"/>
+        </w:rPr>
+        <w:t>The following curl commands can be used to independently verify C2PA manifests against the live Encypher Enterprise API. No authentication is required for verification.</w:t>
+      </w:r>
+    </w:p>
+    <w:p>
+      <w:pPr>
+        <w:spacing w:before="40" w:after="80"/>
+      </w:pPr>
+      <w:r>
+        <w:rPr>
+          <w:rFonts w:ascii="Calibri" w:hAnsi="Calibri"/>
+          <w:sz w:val="22"/>
+        </w:rPr>
+      </w:r>
+      <w:r>
+        <w:rPr>
+          <w:rFonts w:ascii="Calibri" w:hAnsi="Calibri"/>
+          <w:b/>
+          <w:sz w:val="22"/>
+        </w:rPr>
+        <w:t>Verify any media file (image, audio, video):</w:t>
+      </w:r>
+      <w:r>
+        <w:rPr>
+          <w:rFonts w:ascii="Calibri" w:hAnsi="Calibri"/>
+          <w:sz w:val="22"/>
+        </w:rPr>
+      </w:r>
+    </w:p>
+    <w:p>
+      <w:pPr>
+        <w:pStyle w:val="NoSpacing"/>
+        <w:spacing w:before="0" w:after="0"/>
+        <w:ind w:left="360"/>
+        <w:shd w:val="clear" w:color="auto" w:fill="F2F2F2"/>
+      </w:pPr>
+      <w:r>
+        <w:rPr>
+          <w:rFonts w:ascii="Consolas" w:hAnsi="Consolas"/>
+          <w:sz w:val="18"/>
+        </w:rPr>
+        <w:t>curl -X POST https://api.encypher.com/api/v1/public/verify/media \</w:t>
+      </w:r>
+    </w:p>
+    <w:p>
+      <w:pPr>
+        <w:pStyle w:val="NoSpacing"/>
+        <w:spacing w:before="0" w:after="0"/>
+        <w:ind w:left="360"/>
+        <w:shd w:val="clear" w:color="auto" w:fill="F2F2F2"/>
+      </w:pPr>
+      <w:r>
+        <w:rPr>
+          <w:rFonts w:ascii="Consolas" w:hAnsi="Consolas"/>
+          <w:sz w:val="18"/>
+        </w:rPr>
+        <w:t xml:space="preserve">  -F "file=@signed_file.jpg;type=image/jpeg" \</w:t>
+      </w:r>
+    </w:p>
+    <w:p>
+      <w:pPr>
+        <w:pStyle w:val="NoSpacing"/>
+        <w:spacing w:before="0" w:after="0"/>
+        <w:ind w:left="360"/>
+        <w:shd w:val="clear" w:color="auto" w:fill="F2F2F2"/>
+      </w:pPr>
+      <w:r>
+        <w:rPr>
+          <w:rFonts w:ascii="Consolas" w:hAnsi="Consolas"/>
+          <w:sz w:val="18"/>
+        </w:rPr>
+        <w:t xml:space="preserve">  -F "mime_type=image/jpeg"</w:t>
+      </w:r>
+    </w:p>
+    <w:p/>
+    <w:p>
+      <w:pPr>
+        <w:spacing w:before="40" w:after="80"/>
+      </w:pPr>
+      <w:r>
+        <w:rPr>
+          <w:rFonts w:ascii="Calibri" w:hAnsi="Calibri"/>
+          <w:sz w:val="22"/>
+        </w:rPr>
+        <w:t>Replace the file path and MIME type as appropriate. Supported MIME types include image/jpeg, image/png, image/webp, image/tiff, image/gif, image/heic, image/heif, image/avif, image/svg+xml, image/x-adobe-dng, audio/wav, audio/mpeg, audio/mp4, audio/flac, audio/ogg, video/mp4, video/quicktime, video/x-msvideo, video/webm.</w:t>
+      </w:r>
+    </w:p>
+    <w:p>
+      <w:pPr>
+        <w:spacing w:before="40" w:after="80"/>
+      </w:pPr>
+      <w:r>
+        <w:rPr>
+          <w:rFonts w:ascii="Calibri" w:hAnsi="Calibri"/>
+          <w:sz w:val="22"/>
+        </w:rPr>
+      </w:r>
+      <w:r>
+        <w:rPr>
+          <w:rFonts w:ascii="Calibri" w:hAnsi="Calibri"/>
+          <w:b/>
+          <w:sz w:val="22"/>
+        </w:rPr>
+        <w:t>Verify text with embedded provenance:</w:t>
+      </w:r>
+      <w:r>
+        <w:rPr>
+          <w:rFonts w:ascii="Calibri" w:hAnsi="Calibri"/>
+          <w:sz w:val="22"/>
+        </w:rPr>
+      </w:r>
+    </w:p>
+    <w:p>
+      <w:pPr>
+        <w:pStyle w:val="NoSpacing"/>
+        <w:spacing w:before="0" w:after="0"/>
+        <w:ind w:left="360"/>
+        <w:shd w:val="clear" w:color="auto" w:fill="F2F2F2"/>
+      </w:pPr>
+      <w:r>
+        <w:rPr>
+          <w:rFonts w:ascii="Consolas" w:hAnsi="Consolas"/>
+          <w:sz w:val="18"/>
+        </w:rPr>
+        <w:t>curl -X POST https://api.encypher.com/api/v1/public/verify \</w:t>
+      </w:r>
+    </w:p>
+    <w:p>
+      <w:pPr>
+        <w:pStyle w:val="NoSpacing"/>
+        <w:spacing w:before="0" w:after="0"/>
+        <w:ind w:left="360"/>
+        <w:shd w:val="clear" w:color="auto" w:fill="F2F2F2"/>
+      </w:pPr>
+      <w:r>
+        <w:rPr>
+          <w:rFonts w:ascii="Consolas" w:hAnsi="Consolas"/>
+          <w:sz w:val="18"/>
+        </w:rPr>
+        <w:t xml:space="preserve">  -H "Content-Type: application/json" \</w:t>
+      </w:r>
+    </w:p>
+    <w:p>
+      <w:pPr>
+        <w:pStyle w:val="NoSpacing"/>
+        <w:spacing w:before="0" w:after="0"/>
+        <w:ind w:left="360"/>
+        <w:shd w:val="clear" w:color="auto" w:fill="F2F2F2"/>
+      </w:pPr>
+      <w:r>
+        <w:rPr>
+          <w:rFonts w:ascii="Consolas" w:hAnsi="Consolas"/>
+          <w:sz w:val="18"/>
+        </w:rPr>
+        <w:t xml:space="preserve">  -d '{"text": "&lt;text with embedded provenance metadata&gt;"}'</w:t>
+      </w:r>
+    </w:p>
+    <w:p/>
+    <w:p>
+      <w:pPr>
+        <w:spacing w:before="40" w:after="80"/>
+      </w:pPr>
+      <w:r>
+        <w:rPr>
+          <w:rFonts w:ascii="Calibri" w:hAnsi="Calibri"/>
+          <w:sz w:val="22"/>
+        </w:rPr>
+      </w:r>
+      <w:r>
+        <w:rPr>
+          <w:rFonts w:ascii="Calibri" w:hAnsi="Calibri"/>
+          <w:b/>
+          <w:sz w:val="22"/>
+        </w:rPr>
+        <w:t>Sign text (requires API key):</w:t>
+      </w:r>
+      <w:r>
+        <w:rPr>
+          <w:rFonts w:ascii="Calibri" w:hAnsi="Calibri"/>
+          <w:sz w:val="22"/>
+        </w:rPr>
+      </w:r>
+    </w:p>
+    <w:p>
+      <w:pPr>
+        <w:pStyle w:val="NoSpacing"/>
+        <w:spacing w:before="0" w:after="0"/>
+        <w:ind w:left="360"/>
+        <w:shd w:val="clear" w:color="auto" w:fill="F2F2F2"/>
+      </w:pPr>
+      <w:r>
+        <w:rPr>
+          <w:rFonts w:ascii="Consolas" w:hAnsi="Consolas"/>
+          <w:sz w:val="18"/>
+        </w:rPr>
+        <w:t>curl -X POST https://api.encypher.com/api/v1/sign \</w:t>
+      </w:r>
+    </w:p>
+    <w:p>
+      <w:pPr>
+        <w:pStyle w:val="NoSpacing"/>
+        <w:spacing w:before="0" w:after="0"/>
+        <w:ind w:left="360"/>
+        <w:shd w:val="clear" w:color="auto" w:fill="F2F2F2"/>
+      </w:pPr>
+      <w:r>
+        <w:rPr>
+          <w:rFonts w:ascii="Consolas" w:hAnsi="Consolas"/>
+          <w:sz w:val="18"/>
+        </w:rPr>
+        <w:t xml:space="preserve">  -H "Authorization: Bearer &lt;API_KEY&gt;" \</w:t>
+      </w:r>
+    </w:p>
+    <w:p>
+      <w:pPr>
+        <w:pStyle w:val="NoSpacing"/>
+        <w:spacing w:before="0" w:after="0"/>
+        <w:ind w:left="360"/>
+        <w:shd w:val="clear" w:color="auto" w:fill="F2F2F2"/>
+      </w:pPr>
+      <w:r>
+        <w:rPr>
+          <w:rFonts w:ascii="Consolas" w:hAnsi="Consolas"/>
+          <w:sz w:val="18"/>
+        </w:rPr>
+        <w:t xml:space="preserve">  -H "Content-Type: application/json" \</w:t>
+      </w:r>
+    </w:p>
+    <w:p>
+      <w:pPr>
+        <w:pStyle w:val="NoSpacing"/>
+        <w:spacing w:before="0" w:after="0"/>
+        <w:ind w:left="360"/>
+        <w:shd w:val="clear" w:color="auto" w:fill="F2F2F2"/>
+      </w:pPr>
+      <w:r>
+        <w:rPr>
+          <w:rFonts w:ascii="Consolas" w:hAnsi="Consolas"/>
+          <w:sz w:val="18"/>
+        </w:rPr>
+        <w:t xml:space="preserve">  -d '{"text": "Content to sign"}'</w:t>
+      </w:r>
+    </w:p>
+    <w:p/>
+    <w:p>
+      <w:pPr>
+        <w:pStyle w:val="Heading2"/>
+        <w:keepNext/>
+        <w:pageBreakBefore w:val="0"/>
+      </w:pPr>
+      <w:r>
+        <w:rPr>
+          <w:rFonts w:ascii="Calibri" w:hAnsi="Calibri"/>
+          <w:b/>
+          <w:color w:val="2E74B5"/>
+          <w:sz w:val="28"/>
+        </w:rPr>
         <w:t>Appendix: Requirement Traceability Matrix</w:t>
       </w:r>
     </w:p>

</xml_diff>

<commit_message>
docs(security-doc): add Pipeline B verification flow and update format list
- Add Verification Services block to architecture diagram
- Add document_verification_service.py and c2pa_manifest_extractor.py to component inventory
- Update cose_signer.py and jumbf.py descriptions to reflect sign + verify
- Add FLAC audio and JPEG XL to Pipeline B format list
- Document full Pipeline B verification flow (extract, JUMBF parse, COSE verify, assertion hash, content hash)
- Regenerate DOCX
</commit_message>
<xml_diff>
--- a/docs/c2pa/conformance/submission/Encypher_Security_Architecture_Document.docx
+++ b/docs/c2pa/conformance/submission/Encypher_Security_Architecture_Document.docx
@@ -1259,7 +1259,7 @@
           <w:rFonts w:ascii="Consolas" w:hAnsi="Consolas"/>
           <w:sz w:val="18"/>
         </w:rPr>
-        <w:t>|  |  | Cryptographic Core                                |    | |</w:t>
+        <w:t>|  |  | Verification Services                              |    | |</w:t>
       </w:r>
     </w:p>
     <w:p>
@@ -1274,7 +1274,7 @@
           <w:rFonts w:ascii="Consolas" w:hAnsi="Consolas"/>
           <w:sz w:val="18"/>
         </w:rPr>
-        <w:t>|  |  | - c2pa_signer.py     (c2pa.Signer factory)        |    | |</w:t>
+        <w:t>|  |  | - c2pa_verifier_core.py (c2pa-python Reader path)  |    | |</w:t>
       </w:r>
     </w:p>
     <w:p>
@@ -1289,7 +1289,7 @@
           <w:rFonts w:ascii="Consolas" w:hAnsi="Consolas"/>
           <w:sz w:val="18"/>
         </w:rPr>
-        <w:t>|  |  | - cose_signer.py     (COSE_Sign1 signing)         |    | |</w:t>
+        <w:t>|  |  | - document_verification_service.py (Pipeline B)    |    | |</w:t>
       </w:r>
     </w:p>
     <w:p>
@@ -1304,7 +1304,7 @@
           <w:rFonts w:ascii="Consolas" w:hAnsi="Consolas"/>
           <w:sz w:val="18"/>
         </w:rPr>
-        <w:t>|  |  | - c2pa_claim_builder.py (CBOR claim construction)  |    | |</w:t>
+        <w:t>|  |  | - c2pa_manifest_extractor.py (format extraction)   |    | |</w:t>
       </w:r>
     </w:p>
     <w:p>
@@ -1319,7 +1319,112 @@
           <w:rFonts w:ascii="Consolas" w:hAnsi="Consolas"/>
           <w:sz w:val="18"/>
         </w:rPr>
-        <w:t>|  |  | - jumbf.py           (ISO 19566-5 serializer)      |    | |</w:t>
+        <w:t>|  |  +--------+-----------------------------------------+    | |</w:t>
+      </w:r>
+    </w:p>
+    <w:p>
+      <w:pPr>
+        <w:pStyle w:val="NoSpacing"/>
+        <w:spacing w:before="0" w:after="0"/>
+        <w:ind w:left="360"/>
+        <w:shd w:val="clear" w:color="auto" w:fill="F2F2F2"/>
+      </w:pPr>
+      <w:r>
+        <w:rPr>
+          <w:rFonts w:ascii="Consolas" w:hAnsi="Consolas"/>
+          <w:sz w:val="18"/>
+        </w:rPr>
+        <w:t>|  |           |                                               | |</w:t>
+      </w:r>
+    </w:p>
+    <w:p>
+      <w:pPr>
+        <w:pStyle w:val="NoSpacing"/>
+        <w:spacing w:before="0" w:after="0"/>
+        <w:ind w:left="360"/>
+        <w:shd w:val="clear" w:color="auto" w:fill="F2F2F2"/>
+      </w:pPr>
+      <w:r>
+        <w:rPr>
+          <w:rFonts w:ascii="Consolas" w:hAnsi="Consolas"/>
+          <w:sz w:val="18"/>
+        </w:rPr>
+        <w:t>|  |  +--------v-----------------------------------------+    | |</w:t>
+      </w:r>
+    </w:p>
+    <w:p>
+      <w:pPr>
+        <w:pStyle w:val="NoSpacing"/>
+        <w:spacing w:before="0" w:after="0"/>
+        <w:ind w:left="360"/>
+        <w:shd w:val="clear" w:color="auto" w:fill="F2F2F2"/>
+      </w:pPr>
+      <w:r>
+        <w:rPr>
+          <w:rFonts w:ascii="Consolas" w:hAnsi="Consolas"/>
+          <w:sz w:val="18"/>
+        </w:rPr>
+        <w:t>|  |  | Cryptographic Core                                |    | |</w:t>
+      </w:r>
+    </w:p>
+    <w:p>
+      <w:pPr>
+        <w:pStyle w:val="NoSpacing"/>
+        <w:spacing w:before="0" w:after="0"/>
+        <w:ind w:left="360"/>
+        <w:shd w:val="clear" w:color="auto" w:fill="F2F2F2"/>
+      </w:pPr>
+      <w:r>
+        <w:rPr>
+          <w:rFonts w:ascii="Consolas" w:hAnsi="Consolas"/>
+          <w:sz w:val="18"/>
+        </w:rPr>
+        <w:t>|  |  | - c2pa_signer.py     (c2pa.Signer factory)        |    | |</w:t>
+      </w:r>
+    </w:p>
+    <w:p>
+      <w:pPr>
+        <w:pStyle w:val="NoSpacing"/>
+        <w:spacing w:before="0" w:after="0"/>
+        <w:ind w:left="360"/>
+        <w:shd w:val="clear" w:color="auto" w:fill="F2F2F2"/>
+      </w:pPr>
+      <w:r>
+        <w:rPr>
+          <w:rFonts w:ascii="Consolas" w:hAnsi="Consolas"/>
+          <w:sz w:val="18"/>
+        </w:rPr>
+        <w:t>|  |  | - cose_signer.py     (COSE_Sign1 sign + verify)   |    | |</w:t>
+      </w:r>
+    </w:p>
+    <w:p>
+      <w:pPr>
+        <w:pStyle w:val="NoSpacing"/>
+        <w:spacing w:before="0" w:after="0"/>
+        <w:ind w:left="360"/>
+        <w:shd w:val="clear" w:color="auto" w:fill="F2F2F2"/>
+      </w:pPr>
+      <w:r>
+        <w:rPr>
+          <w:rFonts w:ascii="Consolas" w:hAnsi="Consolas"/>
+          <w:sz w:val="18"/>
+        </w:rPr>
+        <w:t>|  |  | - c2pa_claim_builder.py (CBOR claim construction)  |    | |</w:t>
+      </w:r>
+    </w:p>
+    <w:p>
+      <w:pPr>
+        <w:pStyle w:val="NoSpacing"/>
+        <w:spacing w:before="0" w:after="0"/>
+        <w:ind w:left="360"/>
+        <w:shd w:val="clear" w:color="auto" w:fill="F2F2F2"/>
+      </w:pPr>
+      <w:r>
+        <w:rPr>
+          <w:rFonts w:ascii="Consolas" w:hAnsi="Consolas"/>
+          <w:sz w:val="18"/>
+        </w:rPr>
+        <w:t>|  |  | - jumbf.py           (ISO 19566-5 serial + parse)  |    | |</w:t>
       </w:r>
     </w:p>
     <w:p>
@@ -1981,7 +2086,7 @@
                 <w:rFonts w:ascii="Calibri" w:hAnsi="Calibri"/>
                 <w:sz w:val="20"/>
               </w:rPr>
-              <w:t>c2pa_signer.py</w:t>
+              <w:t>Verification services</w:t>
             </w:r>
           </w:p>
         </w:tc>
@@ -1999,7 +2104,7 @@
                 <w:rFonts w:ascii="Calibri" w:hAnsi="Calibri"/>
                 <w:sz w:val="20"/>
               </w:rPr>
-              <w:t>Creates c2pa.Signer from PEM credentials</w:t>
+              <w:t>Media-type-specific C2PA verification</w:t>
             </w:r>
           </w:p>
         </w:tc>
@@ -2040,7 +2145,7 @@
                 <w:rFonts w:ascii="Calibri" w:hAnsi="Calibri"/>
                 <w:sz w:val="20"/>
               </w:rPr>
-              <w:t>cose_signer.py</w:t>
+              <w:t>document_verification_service.py</w:t>
             </w:r>
           </w:p>
         </w:tc>
@@ -2058,7 +2163,7 @@
                 <w:rFonts w:ascii="Calibri" w:hAnsi="Calibri"/>
                 <w:sz w:val="20"/>
               </w:rPr>
-              <w:t>COSE_Sign1_Tagged signing (RFC 9052) for custom pipeline</w:t>
+              <w:t>Pipeline B verification (extract, JUMBF parse, COSE verify, hash check)</w:t>
             </w:r>
           </w:p>
         </w:tc>
@@ -2099,7 +2204,7 @@
                 <w:rFonts w:ascii="Calibri" w:hAnsi="Calibri"/>
                 <w:sz w:val="20"/>
               </w:rPr>
-              <w:t>c2pa_claim_builder.py</w:t>
+              <w:t>c2pa_manifest_extractor.py</w:t>
             </w:r>
           </w:p>
         </w:tc>
@@ -2117,7 +2222,7 @@
                 <w:rFonts w:ascii="Calibri" w:hAnsi="Calibri"/>
                 <w:sz w:val="20"/>
               </w:rPr>
-              <w:t>C2PA Claim v2 CBOR construction for custom pipeline</w:t>
+              <w:t>Per-format JUMBF extraction (PDF, ZIP, SFNT, FLAC, JXL)</w:t>
             </w:r>
           </w:p>
         </w:tc>
@@ -2158,7 +2263,7 @@
                 <w:rFonts w:ascii="Calibri" w:hAnsi="Calibri"/>
                 <w:sz w:val="20"/>
               </w:rPr>
-              <w:t>jumbf.py</w:t>
+              <w:t>c2pa_signer.py</w:t>
             </w:r>
           </w:p>
         </w:tc>
@@ -2176,7 +2281,7 @@
                 <w:rFonts w:ascii="Calibri" w:hAnsi="Calibri"/>
                 <w:sz w:val="20"/>
               </w:rPr>
-              <w:t>ISO 19566-5 JUMBF box serializer for custom pipeline</w:t>
+              <w:t>Creates c2pa.Signer from PEM credentials</w:t>
             </w:r>
           </w:p>
         </w:tc>
@@ -2217,7 +2322,7 @@
                 <w:rFonts w:ascii="Calibri" w:hAnsi="Calibri"/>
                 <w:sz w:val="20"/>
               </w:rPr>
-              <w:t>c2pa_trust_list.py</w:t>
+              <w:t>cose_signer.py</w:t>
             </w:r>
           </w:p>
         </w:tc>
@@ -2235,7 +2340,7 @@
                 <w:rFonts w:ascii="Calibri" w:hAnsi="Calibri"/>
                 <w:sz w:val="20"/>
               </w:rPr>
-              <w:t>Trust anchor loading, chain validation, OCSP, denylist</w:t>
+              <w:t>COSE_Sign1_Tagged signing and verification (RFC 9052)</w:t>
             </w:r>
           </w:p>
         </w:tc>
@@ -2276,7 +2381,7 @@
                 <w:rFonts w:ascii="Calibri" w:hAnsi="Calibri"/>
                 <w:sz w:val="20"/>
               </w:rPr>
-              <w:t>c2pa-python</w:t>
+              <w:t>c2pa_claim_builder.py</w:t>
             </w:r>
           </w:p>
         </w:tc>
@@ -2294,7 +2399,243 @@
                 <w:rFonts w:ascii="Calibri" w:hAnsi="Calibri"/>
                 <w:sz w:val="20"/>
               </w:rPr>
+              <w:t>C2PA Claim v2 CBOR construction for custom pipeline</w:t>
+            </w:r>
+          </w:p>
+        </w:tc>
+        <w:tc>
+          <w:tcPr>
+            <w:tcW w:type="dxa" w:w="3120"/>
+            <w:shd w:val="clear" w:color="auto" w:fill="F2F2F2"/>
+          </w:tcPr>
+          <w:p>
+            <w:pPr>
+              <w:spacing w:before="60" w:after="60"/>
+            </w:pPr>
+            <w:r>
+              <w:rPr>
+                <w:rFonts w:ascii="Calibri" w:hAnsi="Calibri"/>
+                <w:sz w:val="20"/>
+              </w:rPr>
+              <w:t>Encypher proprietary</w:t>
+            </w:r>
+          </w:p>
+        </w:tc>
+      </w:tr>
+      <w:tr>
+        <w:trPr>
+          <w:cantSplit/>
+        </w:trPr>
+        <w:tc>
+          <w:tcPr>
+            <w:tcW w:type="dxa" w:w="3120"/>
+            <w:shd w:val="clear" w:color="auto" w:fill="FFFFFF"/>
+          </w:tcPr>
+          <w:p>
+            <w:pPr>
+              <w:spacing w:before="60" w:after="60"/>
+            </w:pPr>
+            <w:r>
+              <w:rPr>
+                <w:rFonts w:ascii="Calibri" w:hAnsi="Calibri"/>
+                <w:sz w:val="20"/>
+              </w:rPr>
+              <w:t>jumbf.py</w:t>
+            </w:r>
+          </w:p>
+        </w:tc>
+        <w:tc>
+          <w:tcPr>
+            <w:tcW w:type="dxa" w:w="3120"/>
+            <w:shd w:val="clear" w:color="auto" w:fill="FFFFFF"/>
+          </w:tcPr>
+          <w:p>
+            <w:pPr>
+              <w:spacing w:before="60" w:after="60"/>
+            </w:pPr>
+            <w:r>
+              <w:rPr>
+                <w:rFonts w:ascii="Calibri" w:hAnsi="Calibri"/>
+                <w:sz w:val="20"/>
+              </w:rPr>
+              <w:t>ISO 19566-5 JUMBF box serialization and parsing</w:t>
+            </w:r>
+          </w:p>
+        </w:tc>
+        <w:tc>
+          <w:tcPr>
+            <w:tcW w:type="dxa" w:w="3120"/>
+            <w:shd w:val="clear" w:color="auto" w:fill="FFFFFF"/>
+          </w:tcPr>
+          <w:p>
+            <w:pPr>
+              <w:spacing w:before="60" w:after="60"/>
+            </w:pPr>
+            <w:r>
+              <w:rPr>
+                <w:rFonts w:ascii="Calibri" w:hAnsi="Calibri"/>
+                <w:sz w:val="20"/>
+              </w:rPr>
+              <w:t>Encypher proprietary</w:t>
+            </w:r>
+          </w:p>
+        </w:tc>
+      </w:tr>
+      <w:tr>
+        <w:trPr>
+          <w:cantSplit/>
+        </w:trPr>
+        <w:tc>
+          <w:tcPr>
+            <w:tcW w:type="dxa" w:w="3120"/>
+            <w:shd w:val="clear" w:color="auto" w:fill="F2F2F2"/>
+          </w:tcPr>
+          <w:p>
+            <w:pPr>
+              <w:spacing w:before="60" w:after="60"/>
+            </w:pPr>
+            <w:r>
+              <w:rPr>
+                <w:rFonts w:ascii="Calibri" w:hAnsi="Calibri"/>
+                <w:sz w:val="20"/>
+              </w:rPr>
+              <w:t>c2pa_trust_list.py</w:t>
+            </w:r>
+          </w:p>
+        </w:tc>
+        <w:tc>
+          <w:tcPr>
+            <w:tcW w:type="dxa" w:w="3120"/>
+            <w:shd w:val="clear" w:color="auto" w:fill="F2F2F2"/>
+          </w:tcPr>
+          <w:p>
+            <w:pPr>
+              <w:spacing w:before="60" w:after="60"/>
+            </w:pPr>
+            <w:r>
+              <w:rPr>
+                <w:rFonts w:ascii="Calibri" w:hAnsi="Calibri"/>
+                <w:sz w:val="20"/>
+              </w:rPr>
+              <w:t>Trust anchor loading, chain validation, OCSP, denylist</w:t>
+            </w:r>
+          </w:p>
+        </w:tc>
+        <w:tc>
+          <w:tcPr>
+            <w:tcW w:type="dxa" w:w="3120"/>
+            <w:shd w:val="clear" w:color="auto" w:fill="F2F2F2"/>
+          </w:tcPr>
+          <w:p>
+            <w:pPr>
+              <w:spacing w:before="60" w:after="60"/>
+            </w:pPr>
+            <w:r>
+              <w:rPr>
+                <w:rFonts w:ascii="Calibri" w:hAnsi="Calibri"/>
+                <w:sz w:val="20"/>
+              </w:rPr>
+              <w:t>Encypher proprietary</w:t>
+            </w:r>
+          </w:p>
+        </w:tc>
+      </w:tr>
+      <w:tr>
+        <w:trPr>
+          <w:cantSplit/>
+        </w:trPr>
+        <w:tc>
+          <w:tcPr>
+            <w:tcW w:type="dxa" w:w="3120"/>
+            <w:shd w:val="clear" w:color="auto" w:fill="FFFFFF"/>
+          </w:tcPr>
+          <w:p>
+            <w:pPr>
+              <w:spacing w:before="60" w:after="60"/>
+            </w:pPr>
+            <w:r>
+              <w:rPr>
+                <w:rFonts w:ascii="Calibri" w:hAnsi="Calibri"/>
+                <w:sz w:val="20"/>
+              </w:rPr>
+              <w:t>c2pa-python</w:t>
+            </w:r>
+          </w:p>
+        </w:tc>
+        <w:tc>
+          <w:tcPr>
+            <w:tcW w:type="dxa" w:w="3120"/>
+            <w:shd w:val="clear" w:color="auto" w:fill="FFFFFF"/>
+          </w:tcPr>
+          <w:p>
+            <w:pPr>
+              <w:spacing w:before="60" w:after="60"/>
+            </w:pPr>
+            <w:r>
+              <w:rPr>
+                <w:rFonts w:ascii="Calibri" w:hAnsi="Calibri"/>
+                <w:sz w:val="20"/>
+              </w:rPr>
               <w:t>C2PA manifest builder/signer/reader (wraps c2pa-rs)</w:t>
+            </w:r>
+          </w:p>
+        </w:tc>
+        <w:tc>
+          <w:tcPr>
+            <w:tcW w:type="dxa" w:w="3120"/>
+            <w:shd w:val="clear" w:color="auto" w:fill="FFFFFF"/>
+          </w:tcPr>
+          <w:p>
+            <w:pPr>
+              <w:spacing w:before="60" w:after="60"/>
+            </w:pPr>
+            <w:r>
+              <w:rPr>
+                <w:rFonts w:ascii="Calibri" w:hAnsi="Calibri"/>
+                <w:sz w:val="20"/>
+              </w:rPr>
+              <w:t>Open-source (pypi)</w:t>
+            </w:r>
+          </w:p>
+        </w:tc>
+      </w:tr>
+      <w:tr>
+        <w:trPr>
+          <w:cantSplit/>
+        </w:trPr>
+        <w:tc>
+          <w:tcPr>
+            <w:tcW w:type="dxa" w:w="3120"/>
+            <w:shd w:val="clear" w:color="auto" w:fill="F2F2F2"/>
+          </w:tcPr>
+          <w:p>
+            <w:pPr>
+              <w:spacing w:before="60" w:after="60"/>
+            </w:pPr>
+            <w:r>
+              <w:rPr>
+                <w:rFonts w:ascii="Calibri" w:hAnsi="Calibri"/>
+                <w:sz w:val="20"/>
+              </w:rPr>
+              <w:t>cryptography</w:t>
+            </w:r>
+          </w:p>
+        </w:tc>
+        <w:tc>
+          <w:tcPr>
+            <w:tcW w:type="dxa" w:w="3120"/>
+            <w:shd w:val="clear" w:color="auto" w:fill="F2F2F2"/>
+          </w:tcPr>
+          <w:p>
+            <w:pPr>
+              <w:spacing w:before="60" w:after="60"/>
+            </w:pPr>
+            <w:r>
+              <w:rPr>
+                <w:rFonts w:ascii="Calibri" w:hAnsi="Calibri"/>
+                <w:sz w:val="20"/>
+              </w:rPr>
+              <w:t>Private key loading, ECDSA/RSA/EdDSA signing, X.509</w:t>
             </w:r>
           </w:p>
         </w:tc>
@@ -2335,7 +2676,7 @@
                 <w:rFonts w:ascii="Calibri" w:hAnsi="Calibri"/>
                 <w:sz w:val="20"/>
               </w:rPr>
-              <w:t>cryptography</w:t>
+              <w:t>cbor2</w:t>
             </w:r>
           </w:p>
         </w:tc>
@@ -2353,7 +2694,7 @@
                 <w:rFonts w:ascii="Calibri" w:hAnsi="Calibri"/>
                 <w:sz w:val="20"/>
               </w:rPr>
-              <w:t>Private key loading, ECDSA/RSA/EdDSA signing, X.509</w:t>
+              <w:t>CBOR encoding/decoding for claims and assertions</w:t>
             </w:r>
           </w:p>
         </w:tc>
@@ -2394,7 +2735,7 @@
                 <w:rFonts w:ascii="Calibri" w:hAnsi="Calibri"/>
                 <w:sz w:val="20"/>
               </w:rPr>
-              <w:t>cbor2</w:t>
+              <w:t>Traefik</w:t>
             </w:r>
           </w:p>
         </w:tc>
@@ -2412,7 +2753,7 @@
                 <w:rFonts w:ascii="Calibri" w:hAnsi="Calibri"/>
                 <w:sz w:val="20"/>
               </w:rPr>
-              <w:t>CBOR encoding/decoding for claims and assertions</w:t>
+              <w:t>Reverse proxy, TLS termination</w:t>
             </w:r>
           </w:p>
         </w:tc>
@@ -2430,7 +2771,7 @@
                 <w:rFonts w:ascii="Calibri" w:hAnsi="Calibri"/>
                 <w:sz w:val="20"/>
               </w:rPr>
-              <w:t>Open-source (pypi)</w:t>
+              <w:t>Open-source</w:t>
             </w:r>
           </w:p>
         </w:tc>
@@ -2453,7 +2794,7 @@
                 <w:rFonts w:ascii="Calibri" w:hAnsi="Calibri"/>
                 <w:sz w:val="20"/>
               </w:rPr>
-              <w:t>Traefik</w:t>
+              <w:t>Docker + Linux</w:t>
             </w:r>
           </w:p>
         </w:tc>
@@ -2471,7 +2812,7 @@
                 <w:rFonts w:ascii="Calibri" w:hAnsi="Calibri"/>
                 <w:sz w:val="20"/>
               </w:rPr>
-              <w:t>Reverse proxy, TLS termination</w:t>
+              <w:t>Container runtime, process isolation</w:t>
             </w:r>
           </w:p>
         </w:tc>
@@ -2479,65 +2820,6 @@
           <w:tcPr>
             <w:tcW w:type="dxa" w:w="3120"/>
             <w:shd w:val="clear" w:color="auto" w:fill="FFFFFF"/>
-          </w:tcPr>
-          <w:p>
-            <w:pPr>
-              <w:spacing w:before="60" w:after="60"/>
-            </w:pPr>
-            <w:r>
-              <w:rPr>
-                <w:rFonts w:ascii="Calibri" w:hAnsi="Calibri"/>
-                <w:sz w:val="20"/>
-              </w:rPr>
-              <w:t>Open-source</w:t>
-            </w:r>
-          </w:p>
-        </w:tc>
-      </w:tr>
-      <w:tr>
-        <w:trPr>
-          <w:cantSplit/>
-        </w:trPr>
-        <w:tc>
-          <w:tcPr>
-            <w:tcW w:type="dxa" w:w="3120"/>
-            <w:shd w:val="clear" w:color="auto" w:fill="F2F2F2"/>
-          </w:tcPr>
-          <w:p>
-            <w:pPr>
-              <w:spacing w:before="60" w:after="60"/>
-            </w:pPr>
-            <w:r>
-              <w:rPr>
-                <w:rFonts w:ascii="Calibri" w:hAnsi="Calibri"/>
-                <w:sz w:val="20"/>
-              </w:rPr>
-              <w:t>Docker + Linux</w:t>
-            </w:r>
-          </w:p>
-        </w:tc>
-        <w:tc>
-          <w:tcPr>
-            <w:tcW w:type="dxa" w:w="3120"/>
-            <w:shd w:val="clear" w:color="auto" w:fill="F2F2F2"/>
-          </w:tcPr>
-          <w:p>
-            <w:pPr>
-              <w:spacing w:before="60" w:after="60"/>
-            </w:pPr>
-            <w:r>
-              <w:rPr>
-                <w:rFonts w:ascii="Calibri" w:hAnsi="Calibri"/>
-                <w:sz w:val="20"/>
-              </w:rPr>
-              <w:t>Container runtime, process isolation</w:t>
-            </w:r>
-          </w:p>
-        </w:tc>
-        <w:tc>
-          <w:tcPr>
-            <w:tcW w:type="dxa" w:w="3120"/>
-            <w:shd w:val="clear" w:color="auto" w:fill="F2F2F2"/>
           </w:tcPr>
           <w:p>
             <w:pPr>
@@ -9488,7 +9770,7 @@
           <w:rFonts w:ascii="Calibri" w:hAnsi="Calibri"/>
           <w:sz w:val="22"/>
         </w:rPr>
-        <w:t>Used for: PDF, EPUB, DOCX, ODT, OXPS, OTF fonts.</w:t>
+        <w:t>Used for: PDF, EPUB, DOCX, ODT, OXPS, OTF/TTF fonts, FLAC audio, JPEG XL.</w:t>
       </w:r>
     </w:p>
     <w:p>
@@ -9894,6 +10176,428 @@
           <w:sz w:val="18"/>
         </w:rPr>
         <w:t>10. Return signed document bytes</w:t>
+      </w:r>
+    </w:p>
+    <w:p/>
+    <w:p>
+      <w:pPr>
+        <w:pStyle w:val="Heading4"/>
+        <w:keepNext/>
+        <w:pageBreakBefore w:val="0"/>
+      </w:pPr>
+      <w:r>
+        <w:rPr>
+          <w:rFonts w:ascii="Calibri" w:hAnsi="Calibri"/>
+          <w:b/>
+          <w:color w:val="262626"/>
+          <w:sz w:val="22"/>
+        </w:rPr>
+        <w:t>Pipeline B Verification Flow</w:t>
+      </w:r>
+    </w:p>
+    <w:p>
+      <w:pPr>
+        <w:pStyle w:val="NoSpacing"/>
+        <w:spacing w:before="0" w:after="0"/>
+        <w:ind w:left="360"/>
+        <w:shd w:val="clear" w:color="auto" w:fill="F2F2F2"/>
+      </w:pPr>
+      <w:r>
+        <w:rPr>
+          <w:rFonts w:ascii="Consolas" w:hAnsi="Consolas"/>
+          <w:sz w:val="18"/>
+        </w:rPr>
+        <w:t>1. API receives file bytes + MIME type via /api/v1/public/verify/media</w:t>
+      </w:r>
+    </w:p>
+    <w:p>
+      <w:pPr>
+        <w:pStyle w:val="NoSpacing"/>
+        <w:spacing w:before="0" w:after="0"/>
+        <w:ind w:left="360"/>
+        <w:shd w:val="clear" w:color="auto" w:fill="F2F2F2"/>
+      </w:pPr>
+      <w:r>
+        <w:rPr>
+          <w:rFonts w:ascii="Consolas" w:hAnsi="Consolas"/>
+          <w:sz w:val="18"/>
+        </w:rPr>
+        <w:t>2. Route to document_verification_service.verify_document_c2pa()</w:t>
+      </w:r>
+    </w:p>
+    <w:p>
+      <w:pPr>
+        <w:pStyle w:val="NoSpacing"/>
+        <w:spacing w:before="0" w:after="0"/>
+        <w:ind w:left="360"/>
+        <w:shd w:val="clear" w:color="auto" w:fill="F2F2F2"/>
+      </w:pPr>
+      <w:r>
+        <w:rPr>
+          <w:rFonts w:ascii="Consolas" w:hAnsi="Consolas"/>
+          <w:sz w:val="18"/>
+        </w:rPr>
+        <w:t>3. Extract manifest: c2pa_manifest_extractor.extract_manifest()</w:t>
+      </w:r>
+    </w:p>
+    <w:p>
+      <w:pPr>
+        <w:pStyle w:val="NoSpacing"/>
+        <w:spacing w:before="0" w:after="0"/>
+        <w:ind w:left="360"/>
+        <w:shd w:val="clear" w:color="auto" w:fill="F2F2F2"/>
+      </w:pPr>
+      <w:r>
+        <w:rPr>
+          <w:rFonts w:ascii="Consolas" w:hAnsi="Consolas"/>
+          <w:sz w:val="18"/>
+        </w:rPr>
+        <w:t xml:space="preserve">   - PDF: locate /AF entry with AFRelationship = C2PA_Manifest, read EF stream</w:t>
+      </w:r>
+    </w:p>
+    <w:p>
+      <w:pPr>
+        <w:pStyle w:val="NoSpacing"/>
+        <w:spacing w:before="0" w:after="0"/>
+        <w:ind w:left="360"/>
+        <w:shd w:val="clear" w:color="auto" w:fill="F2F2F2"/>
+      </w:pPr>
+      <w:r>
+        <w:rPr>
+          <w:rFonts w:ascii="Consolas" w:hAnsi="Consolas"/>
+          <w:sz w:val="18"/>
+        </w:rPr>
+        <w:t xml:space="preserve">   - ZIP-based (EPUB, DOCX, ODT, OXPS): read META-INF/content_credential.c2pa</w:t>
+      </w:r>
+    </w:p>
+    <w:p>
+      <w:pPr>
+        <w:pStyle w:val="NoSpacing"/>
+        <w:spacing w:before="0" w:after="0"/>
+        <w:ind w:left="360"/>
+        <w:shd w:val="clear" w:color="auto" w:fill="F2F2F2"/>
+      </w:pPr>
+      <w:r>
+        <w:rPr>
+          <w:rFonts w:ascii="Consolas" w:hAnsi="Consolas"/>
+          <w:sz w:val="18"/>
+        </w:rPr>
+        <w:t xml:space="preserve">   - Font (OTF/TTF): parse SFNT table directory, read C2PA table</w:t>
+      </w:r>
+    </w:p>
+    <w:p>
+      <w:pPr>
+        <w:pStyle w:val="NoSpacing"/>
+        <w:spacing w:before="0" w:after="0"/>
+        <w:ind w:left="360"/>
+        <w:shd w:val="clear" w:color="auto" w:fill="F2F2F2"/>
+      </w:pPr>
+      <w:r>
+        <w:rPr>
+          <w:rFonts w:ascii="Consolas" w:hAnsi="Consolas"/>
+          <w:sz w:val="18"/>
+        </w:rPr>
+        <w:t xml:space="preserve">   - FLAC: parse metadata blocks, read APPLICATION block with app_id 'c2pa'</w:t>
+      </w:r>
+    </w:p>
+    <w:p>
+      <w:pPr>
+        <w:pStyle w:val="NoSpacing"/>
+        <w:spacing w:before="0" w:after="0"/>
+        <w:ind w:left="360"/>
+        <w:shd w:val="clear" w:color="auto" w:fill="F2F2F2"/>
+      </w:pPr>
+      <w:r>
+        <w:rPr>
+          <w:rFonts w:ascii="Consolas" w:hAnsi="Consolas"/>
+          <w:sz w:val="18"/>
+        </w:rPr>
+        <w:t xml:space="preserve">   - JXL: parse ISOBMFF boxes, read 'c2pa' box payload</w:t>
+      </w:r>
+    </w:p>
+    <w:p>
+      <w:pPr>
+        <w:pStyle w:val="NoSpacing"/>
+        <w:spacing w:before="0" w:after="0"/>
+        <w:ind w:left="360"/>
+        <w:shd w:val="clear" w:color="auto" w:fill="F2F2F2"/>
+      </w:pPr>
+      <w:r>
+        <w:rPr>
+          <w:rFonts w:ascii="Consolas" w:hAnsi="Consolas"/>
+          <w:sz w:val="18"/>
+        </w:rPr>
+        <w:t>4. Parse JUMBF manifest store: jumbf.parse_manifest_store()</w:t>
+      </w:r>
+    </w:p>
+    <w:p>
+      <w:pPr>
+        <w:pStyle w:val="NoSpacing"/>
+        <w:spacing w:before="0" w:after="0"/>
+        <w:ind w:left="360"/>
+        <w:shd w:val="clear" w:color="auto" w:fill="F2F2F2"/>
+      </w:pPr>
+      <w:r>
+        <w:rPr>
+          <w:rFonts w:ascii="Consolas" w:hAnsi="Consolas"/>
+          <w:sz w:val="18"/>
+        </w:rPr>
+        <w:t xml:space="preserve">   - Locates active manifest (last manifest in store)</w:t>
+      </w:r>
+    </w:p>
+    <w:p>
+      <w:pPr>
+        <w:pStyle w:val="NoSpacing"/>
+        <w:spacing w:before="0" w:after="0"/>
+        <w:ind w:left="360"/>
+        <w:shd w:val="clear" w:color="auto" w:fill="F2F2F2"/>
+      </w:pPr>
+      <w:r>
+        <w:rPr>
+          <w:rFonts w:ascii="Consolas" w:hAnsi="Consolas"/>
+          <w:sz w:val="18"/>
+        </w:rPr>
+        <w:t xml:space="preserve">   - Extracts assertion store (CBOR payloads + raw JUMBF bytes), claim, signature</w:t>
+      </w:r>
+    </w:p>
+    <w:p>
+      <w:pPr>
+        <w:pStyle w:val="NoSpacing"/>
+        <w:spacing w:before="0" w:after="0"/>
+        <w:ind w:left="360"/>
+        <w:shd w:val="clear" w:color="auto" w:fill="F2F2F2"/>
+      </w:pPr>
+      <w:r>
+        <w:rPr>
+          <w:rFonts w:ascii="Consolas" w:hAnsi="Consolas"/>
+          <w:sz w:val="18"/>
+        </w:rPr>
+        <w:t>5. Verify COSE_Sign1 signature: cose_signer.verify_cose_sign1()</w:t>
+      </w:r>
+    </w:p>
+    <w:p>
+      <w:pPr>
+        <w:pStyle w:val="NoSpacing"/>
+        <w:spacing w:before="0" w:after="0"/>
+        <w:ind w:left="360"/>
+        <w:shd w:val="clear" w:color="auto" w:fill="F2F2F2"/>
+      </w:pPr>
+      <w:r>
+        <w:rPr>
+          <w:rFonts w:ascii="Consolas" w:hAnsi="Consolas"/>
+          <w:sz w:val="18"/>
+        </w:rPr>
+        <w:t xml:space="preserve">   - Reconstructs Sig_structure: ["Signature1", protected, b"", claim_cbor]</w:t>
+      </w:r>
+    </w:p>
+    <w:p>
+      <w:pPr>
+        <w:pStyle w:val="NoSpacing"/>
+        <w:spacing w:before="0" w:after="0"/>
+        <w:ind w:left="360"/>
+        <w:shd w:val="clear" w:color="auto" w:fill="F2F2F2"/>
+      </w:pPr>
+      <w:r>
+        <w:rPr>
+          <w:rFonts w:ascii="Consolas" w:hAnsi="Consolas"/>
+          <w:sz w:val="18"/>
+        </w:rPr>
+        <w:t xml:space="preserve">   - Verifies ECDSA/RSA/EdDSA signature against public key from x5chain</w:t>
+      </w:r>
+    </w:p>
+    <w:p>
+      <w:pPr>
+        <w:pStyle w:val="NoSpacing"/>
+        <w:spacing w:before="0" w:after="0"/>
+        <w:ind w:left="360"/>
+        <w:shd w:val="clear" w:color="auto" w:fill="F2F2F2"/>
+      </w:pPr>
+      <w:r>
+        <w:rPr>
+          <w:rFonts w:ascii="Consolas" w:hAnsi="Consolas"/>
+          <w:sz w:val="18"/>
+        </w:rPr>
+        <w:t xml:space="preserve">   - Validates certificate chain</w:t>
+      </w:r>
+    </w:p>
+    <w:p>
+      <w:pPr>
+        <w:pStyle w:val="NoSpacing"/>
+        <w:spacing w:before="0" w:after="0"/>
+        <w:ind w:left="360"/>
+        <w:shd w:val="clear" w:color="auto" w:fill="F2F2F2"/>
+      </w:pPr>
+      <w:r>
+        <w:rPr>
+          <w:rFonts w:ascii="Consolas" w:hAnsi="Consolas"/>
+          <w:sz w:val="18"/>
+        </w:rPr>
+        <w:t>6. Verify assertion hashes:</w:t>
+      </w:r>
+    </w:p>
+    <w:p>
+      <w:pPr>
+        <w:pStyle w:val="NoSpacing"/>
+        <w:spacing w:before="0" w:after="0"/>
+        <w:ind w:left="360"/>
+        <w:shd w:val="clear" w:color="auto" w:fill="F2F2F2"/>
+      </w:pPr>
+      <w:r>
+        <w:rPr>
+          <w:rFonts w:ascii="Consolas" w:hAnsi="Consolas"/>
+          <w:sz w:val="18"/>
+        </w:rPr>
+        <w:t xml:space="preserve">   - Decode claim CBOR, extract hashed assertion URI references</w:t>
+      </w:r>
+    </w:p>
+    <w:p>
+      <w:pPr>
+        <w:pStyle w:val="NoSpacing"/>
+        <w:spacing w:before="0" w:after="0"/>
+        <w:ind w:left="360"/>
+        <w:shd w:val="clear" w:color="auto" w:fill="F2F2F2"/>
+      </w:pPr>
+      <w:r>
+        <w:rPr>
+          <w:rFonts w:ascii="Consolas" w:hAnsi="Consolas"/>
+          <w:sz w:val="18"/>
+        </w:rPr>
+        <w:t xml:space="preserve">   - For each assertion: SHA-256 hash raw JUMBF content, compare to claim value</w:t>
+      </w:r>
+    </w:p>
+    <w:p>
+      <w:pPr>
+        <w:pStyle w:val="NoSpacing"/>
+        <w:spacing w:before="0" w:after="0"/>
+        <w:ind w:left="360"/>
+        <w:shd w:val="clear" w:color="auto" w:fill="F2F2F2"/>
+      </w:pPr>
+      <w:r>
+        <w:rPr>
+          <w:rFonts w:ascii="Consolas" w:hAnsi="Consolas"/>
+          <w:sz w:val="18"/>
+        </w:rPr>
+        <w:t>7. Verify content hash:</w:t>
+      </w:r>
+    </w:p>
+    <w:p>
+      <w:pPr>
+        <w:pStyle w:val="NoSpacing"/>
+        <w:spacing w:before="0" w:after="0"/>
+        <w:ind w:left="360"/>
+        <w:shd w:val="clear" w:color="auto" w:fill="F2F2F2"/>
+      </w:pPr>
+      <w:r>
+        <w:rPr>
+          <w:rFonts w:ascii="Consolas" w:hAnsi="Consolas"/>
+          <w:sz w:val="18"/>
+        </w:rPr>
+        <w:t xml:space="preserve">   - PDF/Font/FLAC/JXL (c2pa.hash.data): read exclusion range from assertion,</w:t>
+      </w:r>
+    </w:p>
+    <w:p>
+      <w:pPr>
+        <w:pStyle w:val="NoSpacing"/>
+        <w:spacing w:before="0" w:after="0"/>
+        <w:ind w:left="360"/>
+        <w:shd w:val="clear" w:color="auto" w:fill="F2F2F2"/>
+      </w:pPr>
+      <w:r>
+        <w:rPr>
+          <w:rFonts w:ascii="Consolas" w:hAnsi="Consolas"/>
+          <w:sz w:val="18"/>
+        </w:rPr>
+        <w:t xml:space="preserve">     cross-check against independently located manifest range,</w:t>
+      </w:r>
+    </w:p>
+    <w:p>
+      <w:pPr>
+        <w:pStyle w:val="NoSpacing"/>
+        <w:spacing w:before="0" w:after="0"/>
+        <w:ind w:left="360"/>
+        <w:shd w:val="clear" w:color="auto" w:fill="F2F2F2"/>
+      </w:pPr>
+      <w:r>
+        <w:rPr>
+          <w:rFonts w:ascii="Consolas" w:hAnsi="Consolas"/>
+          <w:sz w:val="18"/>
+        </w:rPr>
+        <w:t xml:space="preserve">     compute SHA-256 with exclusion zeroed out</w:t>
+      </w:r>
+    </w:p>
+    <w:p>
+      <w:pPr>
+        <w:pStyle w:val="NoSpacing"/>
+        <w:spacing w:before="0" w:after="0"/>
+        <w:ind w:left="360"/>
+        <w:shd w:val="clear" w:color="auto" w:fill="F2F2F2"/>
+      </w:pPr>
+      <w:r>
+        <w:rPr>
+          <w:rFonts w:ascii="Consolas" w:hAnsi="Consolas"/>
+          <w:sz w:val="18"/>
+        </w:rPr>
+        <w:t xml:space="preserve">   - ZIP-based (c2pa.hash.collection.data): recompute per-file local entry</w:t>
+      </w:r>
+    </w:p>
+    <w:p>
+      <w:pPr>
+        <w:pStyle w:val="NoSpacing"/>
+        <w:spacing w:before="0" w:after="0"/>
+        <w:ind w:left="360"/>
+        <w:shd w:val="clear" w:color="auto" w:fill="F2F2F2"/>
+      </w:pPr>
+      <w:r>
+        <w:rPr>
+          <w:rFonts w:ascii="Consolas" w:hAnsi="Consolas"/>
+          <w:sz w:val="18"/>
+        </w:rPr>
+        <w:t xml:space="preserve">     hashes and central directory hash, compare to stored values</w:t>
+      </w:r>
+    </w:p>
+    <w:p>
+      <w:pPr>
+        <w:pStyle w:val="NoSpacing"/>
+        <w:spacing w:before="0" w:after="0"/>
+        <w:ind w:left="360"/>
+        <w:shd w:val="clear" w:color="auto" w:fill="F2F2F2"/>
+      </w:pPr>
+      <w:r>
+        <w:rPr>
+          <w:rFonts w:ascii="Consolas" w:hAnsi="Consolas"/>
+          <w:sz w:val="18"/>
+        </w:rPr>
+        <w:t>8. Extract signer identity (CN) and timestamp from COSE headers</w:t>
+      </w:r>
+    </w:p>
+    <w:p>
+      <w:pPr>
+        <w:pStyle w:val="NoSpacing"/>
+        <w:spacing w:before="0" w:after="0"/>
+        <w:ind w:left="360"/>
+        <w:shd w:val="clear" w:color="auto" w:fill="F2F2F2"/>
+      </w:pPr>
+      <w:r>
+        <w:rPr>
+          <w:rFonts w:ascii="Consolas" w:hAnsi="Consolas"/>
+          <w:sz w:val="18"/>
+        </w:rPr>
+        <w:t>9. Return C2paVerificationResult (valid, c2pa_manifest_valid, hash_matches,</w:t>
+      </w:r>
+    </w:p>
+    <w:p>
+      <w:pPr>
+        <w:pStyle w:val="NoSpacing"/>
+        <w:spacing w:before="0" w:after="0"/>
+        <w:ind w:left="360"/>
+        <w:shd w:val="clear" w:color="auto" w:fill="F2F2F2"/>
+      </w:pPr>
+      <w:r>
+        <w:rPr>
+          <w:rFonts w:ascii="Consolas" w:hAnsi="Consolas"/>
+          <w:sz w:val="18"/>
+        </w:rPr>
+        <w:t xml:space="preserve">   signer info, manifest_data matching c2pa-python Reader format)</w:t>
       </w:r>
     </w:p>
     <w:p/>

</xml_diff>

<commit_message>
docs(security-doc): fix pipeline format counts and add FLAC/JXL to Pipeline B signing flow
Pipeline A: correct image count to 12 (JXL uses Pipeline B), audio to 5
(FLAC uses Pipeline B). Pipeline B signing flow: add per-format details
for FLAC (APPLICATION block) and JXL (ISOBMFF c2pa box) placeholder
insertion and hash computation. Regenerate DOCX.
</commit_message>
<xml_diff>
--- a/docs/c2pa/conformance/submission/Encypher_Security_Architecture_Document.docx
+++ b/docs/c2pa/conformance/submission/Encypher_Security_Architecture_Document.docx
@@ -9473,7 +9473,7 @@
           <w:color w:val="2E74B5"/>
           <w:sz w:val="28"/>
         </w:rPr>
-        <w:t>Appendix: Signing Pipeline Flow Detail</w:t>
+        <w:t>Appendix: Signing and Verification Pipeline Flow Detail</w:t>
       </w:r>
     </w:p>
     <w:p>
@@ -9501,7 +9501,7 @@
           <w:rFonts w:ascii="Calibri" w:hAnsi="Calibri"/>
           <w:sz w:val="22"/>
         </w:rPr>
-        <w:t>Used for: images (13 types), video (3 types), audio (4 types).</w:t>
+        <w:t>Used for: images (12 types -- all except JXL), video (3 types), audio (5 types -- all except FLAC). JXL and FLAC use Pipeline B because c2pa-python/c2pa-rs does not yet support these container formats.</w:t>
       </w:r>
     </w:p>
     <w:p>
@@ -9758,7 +9758,7 @@
           <w:color w:val="4472C4"/>
           <w:sz w:val="24"/>
         </w:rPr>
-        <w:t>Pipeline B: Document formats (custom JUMBF/COSE path)</w:t>
+        <w:t>Pipeline B: Custom JUMBF/COSE path</w:t>
       </w:r>
     </w:p>
     <w:p>
@@ -9770,7 +9770,7 @@
           <w:rFonts w:ascii="Calibri" w:hAnsi="Calibri"/>
           <w:sz w:val="22"/>
         </w:rPr>
-        <w:t>Used for: PDF, EPUB, DOCX, ODT, OXPS, OTF/TTF fonts, FLAC audio, JPEG XL.</w:t>
+        <w:t>Used for formats where c2pa-python/c2pa-rs lacks native container support: documents (PDF, EPUB, DOCX, ODT, OXPS), fonts (OTF/TTF), FLAC audio, JPEG XL.</w:t>
       </w:r>
     </w:p>
     <w:p>
@@ -9815,7 +9815,7 @@
           <w:rFonts w:ascii="Consolas" w:hAnsi="Consolas"/>
           <w:sz w:val="18"/>
         </w:rPr>
-        <w:t>3. Pass 1: Create document with placeholder manifest</w:t>
+        <w:t>3. Pass 1: Create file with placeholder manifest</w:t>
       </w:r>
     </w:p>
     <w:p>
@@ -9845,7 +9845,7 @@
           <w:rFonts w:ascii="Consolas" w:hAnsi="Consolas"/>
           <w:sz w:val="18"/>
         </w:rPr>
-        <w:t xml:space="preserve">   - ZIP-based: add c2pa.c2m entry to ZIP archive</w:t>
+        <w:t xml:space="preserve">   - ZIP-based (EPUB, DOCX, ODT, OXPS): add c2pa.c2m entry to ZIP archive</w:t>
       </w:r>
     </w:p>
     <w:p>
@@ -9860,7 +9860,7 @@
           <w:rFonts w:ascii="Consolas" w:hAnsi="Consolas"/>
           <w:sz w:val="18"/>
         </w:rPr>
-        <w:t xml:space="preserve">   - Font: add C2PA SFNT table with placeholder</w:t>
+        <w:t xml:space="preserve">   - Font (OTF/TTF): add C2PA SFNT table with placeholder</w:t>
       </w:r>
     </w:p>
     <w:p>
@@ -9875,7 +9875,7 @@
           <w:rFonts w:ascii="Consolas" w:hAnsi="Consolas"/>
           <w:sz w:val="18"/>
         </w:rPr>
-        <w:t>4. Compute content binding hashes (SHA-256):</w:t>
+        <w:t xml:space="preserve">   - FLAC: add APPLICATION metadata block with app_id 'c2pa' and placeholder</w:t>
       </w:r>
     </w:p>
     <w:p>
@@ -9890,7 +9890,7 @@
           <w:rFonts w:ascii="Consolas" w:hAnsi="Consolas"/>
           <w:sz w:val="18"/>
         </w:rPr>
-        <w:t xml:space="preserve">   - PDF: hash document bytes excluding placeholder region</w:t>
+        <w:t xml:space="preserve">   - JXL: add ISOBMFF 'c2pa' box with placeholder</w:t>
       </w:r>
     </w:p>
     <w:p>
@@ -9905,7 +9905,7 @@
           <w:rFonts w:ascii="Consolas" w:hAnsi="Consolas"/>
           <w:sz w:val="18"/>
         </w:rPr>
-        <w:t xml:space="preserve">   - ZIP: hash individual files + central directory</w:t>
+        <w:t>4. Compute content binding hashes (SHA-256):</w:t>
       </w:r>
     </w:p>
     <w:p>
@@ -9920,7 +9920,67 @@
           <w:rFonts w:ascii="Consolas" w:hAnsi="Consolas"/>
           <w:sz w:val="18"/>
         </w:rPr>
+        <w:t xml:space="preserve">   - PDF: hash document bytes excluding placeholder region</w:t>
+      </w:r>
+    </w:p>
+    <w:p>
+      <w:pPr>
+        <w:pStyle w:val="NoSpacing"/>
+        <w:spacing w:before="0" w:after="0"/>
+        <w:ind w:left="360"/>
+        <w:shd w:val="clear" w:color="auto" w:fill="F2F2F2"/>
+      </w:pPr>
+      <w:r>
+        <w:rPr>
+          <w:rFonts w:ascii="Consolas" w:hAnsi="Consolas"/>
+          <w:sz w:val="18"/>
+        </w:rPr>
+        <w:t xml:space="preserve">   - ZIP: hash individual files + central directory</w:t>
+      </w:r>
+    </w:p>
+    <w:p>
+      <w:pPr>
+        <w:pStyle w:val="NoSpacing"/>
+        <w:spacing w:before="0" w:after="0"/>
+        <w:ind w:left="360"/>
+        <w:shd w:val="clear" w:color="auto" w:fill="F2F2F2"/>
+      </w:pPr>
+      <w:r>
+        <w:rPr>
+          <w:rFonts w:ascii="Consolas" w:hAnsi="Consolas"/>
+          <w:sz w:val="18"/>
+        </w:rPr>
         <w:t xml:space="preserve">   - Font: hash font data excluding C2PA table</w:t>
+      </w:r>
+    </w:p>
+    <w:p>
+      <w:pPr>
+        <w:pStyle w:val="NoSpacing"/>
+        <w:spacing w:before="0" w:after="0"/>
+        <w:ind w:left="360"/>
+        <w:shd w:val="clear" w:color="auto" w:fill="F2F2F2"/>
+      </w:pPr>
+      <w:r>
+        <w:rPr>
+          <w:rFonts w:ascii="Consolas" w:hAnsi="Consolas"/>
+          <w:sz w:val="18"/>
+        </w:rPr>
+        <w:t xml:space="preserve">   - FLAC: hash file bytes excluding APPLICATION block data range</w:t>
+      </w:r>
+    </w:p>
+    <w:p>
+      <w:pPr>
+        <w:pStyle w:val="NoSpacing"/>
+        <w:spacing w:before="0" w:after="0"/>
+        <w:ind w:left="360"/>
+        <w:shd w:val="clear" w:color="auto" w:fill="F2F2F2"/>
+      </w:pPr>
+      <w:r>
+        <w:rPr>
+          <w:rFonts w:ascii="Consolas" w:hAnsi="Consolas"/>
+          <w:sz w:val="18"/>
+        </w:rPr>
+        <w:t xml:space="preserve">   - JXL: hash file bytes excluding 'c2pa' box data range</w:t>
       </w:r>
     </w:p>
     <w:p>

</xml_diff>